<commit_message>
Revisi Proposal v2: eliminasi pengujian simultan (H4), perapihan cover dan narasi Bab 1, sinkronisasi docx/pdf 34 hlm Lulus Audit 52/52
</commit_message>
<xml_diff>
--- a/01_Naskah_Utama/Proposal_Skripsi_MLBB_GenZ_v2.docx
+++ b/01_Naskah_Utama/Proposal_Skripsi_MLBB_GenZ_v2.docx
@@ -4,6 +4,46 @@
   <w:body>
     <w:p>
       <w:pPr>
+        <w:spacing w:line="240" w:lineRule="auto" w:before="0" w:after="360"/>
+        <w:jc w:val="center"/>
+      </w:pPr>
+      <w:r>
+        <w:drawing>
+          <wp:inline xmlns:a="http://schemas.openxmlformats.org/drawingml/2006/main" xmlns:pic="http://schemas.openxmlformats.org/drawingml/2006/picture">
+            <wp:extent cx="1152000" cy="1152000"/>
+            <wp:docPr id="1" name="Picture 1"/>
+            <wp:cNvGraphicFramePr>
+              <a:graphicFrameLocks noChangeAspect="1"/>
+            </wp:cNvGraphicFramePr>
+            <a:graphic>
+              <a:graphicData uri="http://schemas.openxmlformats.org/drawingml/2006/picture">
+                <pic:pic>
+                  <pic:nvPicPr>
+                    <pic:cNvPr id="0" name="ukrida_pentagram.png"/>
+                    <pic:cNvPicPr/>
+                  </pic:nvPicPr>
+                  <pic:blipFill>
+                    <a:blip r:embed="rId11"/>
+                    <a:stretch>
+                      <a:fillRect/>
+                    </a:stretch>
+                  </pic:blipFill>
+                  <pic:spPr>
+                    <a:xfrm>
+                      <a:off x="0" y="0"/>
+                      <a:ext cx="1152000" cy="1152000"/>
+                    </a:xfrm>
+                    <a:prstGeom prst="rect"/>
+                  </pic:spPr>
+                </pic:pic>
+              </a:graphicData>
+            </a:graphic>
+          </wp:inline>
+        </w:drawing>
+      </w:r>
+    </w:p>
+    <w:p>
+      <w:pPr>
         <w:spacing w:line="240" w:lineRule="auto" w:before="120" w:after="360"/>
         <w:jc w:val="center"/>
       </w:pPr>
@@ -187,7 +227,7 @@
           <w:color w:val="000000"/>
           <w:sz w:val="24"/>
         </w:rPr>
-        <w:t>Diajukan Kepada Program Studi S1 Manajemen</w:t>
+        <w:t>Diajukan Kepada Program Studi Manajemen</w:t>
       </w:r>
     </w:p>
     <w:p>
@@ -203,7 +243,7 @@
           <w:color w:val="000000"/>
           <w:sz w:val="24"/>
         </w:rPr>
-        <w:t>Untuk Menyusun Tugas Akhir Sarjana Manajemen (S.M.)</w:t>
+        <w:t>Untuk Menyusun Tugas Akhir Sarjana Manajemen</w:t>
       </w:r>
     </w:p>
     <w:p>
@@ -232,7 +272,7 @@
           <w:color w:val="000000"/>
           <w:sz w:val="24"/>
         </w:rPr>
-        <w:t>Nama : Siddharta Pratama Budiono</w:t>
+        <w:t>Siddharta Pratama Budiono</w:t>
       </w:r>
       <w:r>
         <w:br/>
@@ -245,7 +285,7 @@
           <w:color w:val="000000"/>
           <w:sz w:val="24"/>
         </w:rPr>
-        <w:t>(NIM : 312023017)</w:t>
+        <w:t>312023017</w:t>
       </w:r>
     </w:p>
     <w:p>
@@ -261,20 +301,7 @@
           <w:color w:val="000000"/>
           <w:sz w:val="24"/>
         </w:rPr>
-        <w:t>PROGRAM STUDI S1 MANAJEMEN</w:t>
-      </w:r>
-      <w:r>
-        <w:br/>
-      </w:r>
-      <w:r>
-        <w:rPr>
-          <w:rFonts w:ascii="Times New Roman" w:hAnsi="Times New Roman" w:cs="Times New Roman" w:eastAsia="Times New Roman"/>
-          <w:b/>
-          <w:i w:val="0"/>
-          <w:color w:val="000000"/>
-          <w:sz w:val="24"/>
-        </w:rPr>
-        <w:t>KONSENTRASI MANAJEMEN PEMASARAN</w:t>
+        <w:t>PROGRAM STUDI MANAJEMEN</w:t>
       </w:r>
       <w:r>
         <w:br/>
@@ -514,7 +541,7 @@
         </w:rPr>
         <w:t>1.2 Rumusan Masalah</w:t>
         <w:tab/>
-        <w:t>8</w:t>
+        <w:t>6</w:t>
       </w:r>
     </w:p>
     <w:p>
@@ -535,7 +562,7 @@
         </w:rPr>
         <w:t>1.3 Tujuan Penelitian</w:t>
         <w:tab/>
-        <w:t>9</w:t>
+        <w:t>7</w:t>
       </w:r>
     </w:p>
     <w:p>
@@ -556,7 +583,7 @@
         </w:rPr>
         <w:t>1.4 Manfaat Penelitian</w:t>
         <w:tab/>
-        <w:t>9</w:t>
+        <w:t>7</w:t>
       </w:r>
     </w:p>
     <w:p>
@@ -577,7 +604,7 @@
         </w:rPr>
         <w:t>1.4.1 Manfaat Teoritis</w:t>
         <w:tab/>
-        <w:t>9</w:t>
+        <w:t>7</w:t>
       </w:r>
     </w:p>
     <w:p>
@@ -598,7 +625,7 @@
         </w:rPr>
         <w:t>1.4.2 Manfaat Praktis</w:t>
         <w:tab/>
-        <w:t>10</w:t>
+        <w:t>7</w:t>
       </w:r>
     </w:p>
     <w:p>
@@ -619,7 +646,7 @@
         </w:rPr>
         <w:t>BAB II TINJAUAN PUSTAKA DAN PENGEMBANGAN HIPOTESIS</w:t>
         <w:tab/>
-        <w:t>11</w:t>
+        <w:t>8</w:t>
       </w:r>
     </w:p>
     <w:p>
@@ -640,7 +667,7 @@
         </w:rPr>
         <w:t>2.1 Landasan Teori</w:t>
         <w:tab/>
-        <w:t>11</w:t>
+        <w:t>8</w:t>
       </w:r>
     </w:p>
     <w:p>
@@ -661,7 +688,7 @@
         </w:rPr>
         <w:t>2.1.1 Influencer Marketing sebagai Kredibilitas Sumber</w:t>
         <w:tab/>
-        <w:t>11</w:t>
+        <w:t>8</w:t>
       </w:r>
     </w:p>
     <w:p>
@@ -682,7 +709,7 @@
         </w:rPr>
         <w:t>2.1.2 Electronic Word of Mouth (eWOM) dan Adopsi Informasi</w:t>
         <w:tab/>
-        <w:t>12</w:t>
+        <w:t>9</w:t>
       </w:r>
     </w:p>
     <w:p>
@@ -703,7 +730,7 @@
         </w:rPr>
         <w:t>2.1.3 Perceived Enjoyment pada Sistem Hedonik</w:t>
         <w:tab/>
-        <w:t>13</w:t>
+        <w:t>10</w:t>
       </w:r>
     </w:p>
     <w:p>
@@ -724,7 +751,7 @@
         </w:rPr>
         <w:t>2.1.4 Intention to Play sebagai Niat Perilaku</w:t>
         <w:tab/>
-        <w:t>14</w:t>
+        <w:t>11</w:t>
       </w:r>
     </w:p>
     <w:p>
@@ -745,7 +772,7 @@
         </w:rPr>
         <w:t>2.1.5 Generasi Z sebagai Konteks, bukan Variabel</w:t>
         <w:tab/>
-        <w:t>15</w:t>
+        <w:t>11</w:t>
       </w:r>
     </w:p>
     <w:p>
@@ -766,7 +793,7 @@
         </w:rPr>
         <w:t>2.2 Penelitian Sebelumnya</w:t>
         <w:tab/>
-        <w:t>15</w:t>
+        <w:t>12</w:t>
       </w:r>
     </w:p>
     <w:p>
@@ -787,7 +814,7 @@
         </w:rPr>
         <w:t>2.3 Pengembangan Hipotesis</w:t>
         <w:tab/>
-        <w:t>18</w:t>
+        <w:t>15</w:t>
       </w:r>
     </w:p>
     <w:p>
@@ -808,7 +835,7 @@
         </w:rPr>
         <w:t>2.4 Rerangka Penelitian</w:t>
         <w:tab/>
-        <w:t>20</w:t>
+        <w:t>16</w:t>
       </w:r>
     </w:p>
     <w:p>
@@ -829,7 +856,7 @@
         </w:rPr>
         <w:t>BAB III METODE PENELITIAN</w:t>
         <w:tab/>
-        <w:t>21</w:t>
+        <w:t>18</w:t>
       </w:r>
     </w:p>
     <w:p>
@@ -850,7 +877,7 @@
         </w:rPr>
         <w:t>3.1 Jenis dan Sumber Data</w:t>
         <w:tab/>
-        <w:t>21</w:t>
+        <w:t>18</w:t>
       </w:r>
     </w:p>
     <w:p>
@@ -871,7 +898,7 @@
         </w:rPr>
         <w:t>3.2 Populasi dan Sampel</w:t>
         <w:tab/>
-        <w:t>22</w:t>
+        <w:t>19</w:t>
       </w:r>
     </w:p>
     <w:p>
@@ -892,7 +919,7 @@
         </w:rPr>
         <w:t>3.3 Model Penelitian</w:t>
         <w:tab/>
-        <w:t>24</w:t>
+        <w:t>20</w:t>
       </w:r>
     </w:p>
     <w:p>
@@ -913,7 +940,7 @@
         </w:rPr>
         <w:t>3.4 Operasionalisasi Variabel</w:t>
         <w:tab/>
-        <w:t>25</w:t>
+        <w:t>21</w:t>
       </w:r>
     </w:p>
     <w:p>
@@ -934,7 +961,7 @@
         </w:rPr>
         <w:t>3.5 Metode Analisis Data</w:t>
         <w:tab/>
-        <w:t>28</w:t>
+        <w:t>25</w:t>
       </w:r>
     </w:p>
     <w:p>
@@ -955,7 +982,7 @@
         </w:rPr>
         <w:t>DAFTAR PUSTAKA</w:t>
         <w:tab/>
-        <w:t>30</w:t>
+        <w:t>27</w:t>
       </w:r>
     </w:p>
     <w:p>
@@ -1003,7 +1030,7 @@
         </w:rPr>
         <w:t>Tabel 2.1 Ringkasan Penelitian Sebelumnya (S01–S18)</w:t>
         <w:tab/>
-        <w:t>15</w:t>
+        <w:t>12</w:t>
       </w:r>
     </w:p>
     <w:p>
@@ -1023,7 +1050,7 @@
         </w:rPr>
         <w:t>Tabel 3.1 Operasionalisasi Variabel</w:t>
         <w:tab/>
-        <w:t>25</w:t>
+        <w:t>21</w:t>
       </w:r>
     </w:p>
     <w:p>
@@ -1071,7 +1098,7 @@
         </w:rPr>
         <w:t>Gambar 2.1 Model Rerangka Konseptual Penelitian</w:t>
         <w:tab/>
-        <w:t>20</w:t>
+        <w:t>16</w:t>
       </w:r>
     </w:p>
     <w:p>
@@ -1088,8 +1115,8 @@
     <w:p>
       <w:pPr>
         <w:sectPr>
-          <w:footerReference w:type="default" r:id="rId11"/>
-          <w:headerReference w:type="default" r:id="rId12"/>
+          <w:footerReference w:type="default" r:id="rId12"/>
+          <w:headerReference w:type="default" r:id="rId13"/>
           <w:pgSz w:w="11906" w:h="16838"/>
           <w:pgMar w:top="1701" w:right="1701" w:bottom="1701" w:left="2268" w:header="720" w:footer="720" w:gutter="0"/>
           <w:cols w:space="720"/>
@@ -1224,7 +1251,27 @@
           <w:color w:val="000000"/>
           <w:sz w:val="24"/>
         </w:rPr>
-        <w:t>Konteks pertama adalah konektivitas nasional yang besar. DataReportal Digital 2026: Indonesia (artikel 05 November 2025, data acuan Oktober 2025, agregator independen multi-primer, cakupan nasional Indonesia, tgl akses 2026-10-01) mencatat 230 juta individu pengguna internet pada Oktober 2025 dengan penetrasi 80,5 persen pada seksi "Internet use" (sumber baris: Kepios, estimasi, bukan sensus). Pada seksi "The state of digital" halaman yang sama mencatat 331 juta koneksi seluler aktif pada akhir 2025 atau 116 persen populasi (sumber baris: GSMA Intelligence, definisi koneksi, bukan individu unik), serta 180 juta identitas pengguna media sosial pada Oktober 2025 atau 62,9 persen populasi (sumber baris: Kepios, definisi identitas, bukan individu unik, de-duplikasi lintas platform bersifat estimasi). Populasi acuan yang dipakai halaman tersebut adalah 286 juta pada Oktober 2025 (sumber baris: UN). Angka ini menunjukkan prasyarat akses yang luas, bukan bukti bermain game.</w:t>
+        <w:t xml:space="preserve">Konteks pertama adalah konektivitas digital nasional yang sangat besar. Berdasarkan laporan </w:t>
+      </w:r>
+      <w:r>
+        <w:rPr>
+          <w:rFonts w:ascii="Times New Roman" w:hAnsi="Times New Roman" w:cs="Times New Roman" w:eastAsia="Times New Roman"/>
+          <w:b w:val="0"/>
+          <w:i/>
+          <w:color w:val="000000"/>
+          <w:sz w:val="24"/>
+        </w:rPr>
+        <w:t>Digital 2026: Indonesia</w:t>
+      </w:r>
+      <w:r>
+        <w:rPr>
+          <w:rFonts w:ascii="Times New Roman" w:hAnsi="Times New Roman" w:cs="Times New Roman" w:eastAsia="Times New Roman"/>
+          <w:b w:val="0"/>
+          <w:i w:val="0"/>
+          <w:color w:val="000000"/>
+          <w:sz w:val="24"/>
+        </w:rPr>
+        <w:t xml:space="preserve"> yang dirilis oleh DataReportal (2025), tercatat sebanyak 230 juta individu pengguna internet di Indonesia pada Oktober 2025. Angka ini merefleksikan tingkat penetrasi internet sebesar 80,5 persen dari total estimasi populasi nasional Indonesia (286 juta jiwa lintas seluruh kelompok umur, bukan terbatas pada Generasi Z). Pada laporan yang sama, tercatat pula 331 juta koneksi seluler aktif (setara 116 persen dari populasi penduduk) serta 180 juta identitas pengguna aktif media sosial atau 62,9 persen dari populasi nasional. Tingginya angka konektivitas makro ini menjadi fondasi prasyarat akses digital dan infrastruktur yang luas bagi masyarakat, sebelum meninjau perilaku adopsi digital pada segmen usia muda yang lebih spesifik.</w:t>
       </w:r>
     </w:p>
     <w:p>
@@ -1242,27 +1289,7 @@
           <w:color w:val="000000"/>
           <w:sz w:val="24"/>
         </w:rPr>
-        <w:t>Survei nasional Asosiasi Penyelenggara Jasa Internet Indonesia (APJII) memberi konteks pendukung dengan catatan status sekunder. Artikel CNN Indonesia tertanggal 21 Mei 2026 yang melaporkan Survei Profil Internet Indonesia 2026 (rilis 19 Mei 2026, Ketua Umum Muhammad Arif, cakupan nasional, tgl akses 2026-10-01, status SEKUNDER — sitasi final wajib PDF primer) menulis penetrasi 81,72 persen atau 235 juta jiwa dari 287 juta populasi, naik 6 juta dibanding 2025. Artikel yang sama menyebut penetrasi Generasi Z 89,02 persen dan Milenial 90,34 persen sebagai yang tertinggi, tetapi tidak memuat definisi rentang lahir sehingga definisi [MENUNGGU VERIFIKASI PDF]. Artikel detikInet tertanggal 06 Agustus 2025 yang melaporkan Survei APJII 2025 (peluncuran 06 Agustus 2025, cakupan nasional, tgl akses 2026-10-01, status SEKUNDER) menulis 229.428.417 jiwa dari 284.430.900 populasi atau 80,66 persen, serta komposisi pengguna internet Generasi Z (lahir 1997–2012) 25,54 persen pada paragraf umur. Komposisi tersebut adalah komposisi pengguna, bukan penetrasi per generasi, dan rentang lahirnya masih menunggu PDF primer. Basis audiens sosial yang besar juga tercermin dari jangkauan iklan (</w:t>
-      </w:r>
-      <w:r>
-        <w:rPr>
-          <w:rFonts w:ascii="Times New Roman" w:hAnsi="Times New Roman" w:cs="Times New Roman" w:eastAsia="Times New Roman"/>
-          <w:b w:val="0"/>
-          <w:i/>
-          <w:color w:val="000000"/>
-          <w:sz w:val="24"/>
-        </w:rPr>
-        <w:t>ad reach</w:t>
-      </w:r>
-      <w:r>
-        <w:rPr>
-          <w:rFonts w:ascii="Times New Roman" w:hAnsi="Times New Roman" w:cs="Times New Roman" w:eastAsia="Times New Roman"/>
-          <w:b w:val="0"/>
-          <w:i w:val="0"/>
-          <w:color w:val="000000"/>
-          <w:sz w:val="24"/>
-        </w:rPr>
-        <w:t>, perangkat perencanaan iklan, bukan pengguna aktif bulanan) pada DataReportal edisi yang sama (data akhir 2025, tgl akses 2026-10-01): YouTube 151 juta, Facebook 121 juta, Instagram 108 juta, dan TikTok 180 juta usia 18 tahun ke atas. Jangkauan iklan tidak sama dengan pengguna unik dan tidak sama dengan pemain.</w:t>
+        <w:t>Sebagai penguat konteks demografis, data Asosiasi Penyelenggara Jasa Internet Indonesia (APJII) mengonfirmasi bahwa Generasi Z merupakan motor utama pemanfaatan internet di Indonesia. Berdasarkan Survei Profil Internet Indonesia 2026 yang dirilis oleh APJII (sebagaimana dilaporkan CNN Indonesia, 2026), tingkat penetrasi internet nasional telah mencapai 81,72 persen atau setara 235 juta jiwa dari total 287 juta penduduk. Dalam laporan tersebut, kelompok Generasi Z mencatatkan tingkat penetrasi yang sangat tinggi, yaitu mencapai 89,02 persen. Temuan ini konsisten dengan laporan survei APJII periode sebelumnya (sebagaimana dilaporkan detikInet, 2025) yang mencatat bahwa segmen Generasi Z (kelahiran 1997–2012) menyumbang kontribusi sebesar 25,54 persen dari total populasi pengguna internet di Indonesia. Tingginya keterlibatan digital ini diperkuat oleh besarnya jangkauan audiens pada media sosial utama di Indonesia, seperti TikTok, YouTube, dan Instagram (DataReportal, 2025). Eksposur digital yang intensif tersebut membentuk ruang interaksi harian bagi Generasi Z, termasuk dalam menerima rekomendasi konten, ulasan komunitas daring, hingga memilih aktivitas hiburan digital.</w:t>
       </w:r>
     </w:p>
     <w:p>
@@ -1280,7 +1307,7 @@
           <w:color w:val="000000"/>
           <w:sz w:val="24"/>
         </w:rPr>
-        <w:t>Konteks kedua adalah skala permainan seluler. Blog Sensor Tower Southeast Asia Mobile Game Market Insights 2025 (penerbit Sensor Tower, penulis Donny Kristianto, edisi Mei 2025, acuan kuartal I 2025, estimasi App Store + Google Play dengan eksklusi pra-instal, unduh ulang, &amp; Android pihak ketiga, cakupan Asia Tenggara, tgl akses 2026-10-01) mencatat Asia Tenggara 1,93 miliar instalasi baru (+3 persen kuartal lawan kuartal, peringkat 2 global unduhan) dan pendapatan pembelian dalam aplikasi (</w:t>
+        <w:t>Konteks kedua adalah pesatnya pertumbuhan industri permainan seluler (</w:t>
       </w:r>
       <w:r>
         <w:rPr>
@@ -1290,6 +1317,46 @@
           <w:color w:val="000000"/>
           <w:sz w:val="24"/>
         </w:rPr>
+        <w:t>mobile games</w:t>
+      </w:r>
+      <w:r>
+        <w:rPr>
+          <w:rFonts w:ascii="Times New Roman" w:hAnsi="Times New Roman" w:cs="Times New Roman" w:eastAsia="Times New Roman"/>
+          <w:b w:val="0"/>
+          <w:i w:val="0"/>
+          <w:color w:val="000000"/>
+          <w:sz w:val="24"/>
+        </w:rPr>
+        <w:t xml:space="preserve">) di kawasan regional dan nasional. Berdasarkan laporan riset pasar Sensor Tower bertajuk </w:t>
+      </w:r>
+      <w:r>
+        <w:rPr>
+          <w:rFonts w:ascii="Times New Roman" w:hAnsi="Times New Roman" w:cs="Times New Roman" w:eastAsia="Times New Roman"/>
+          <w:b w:val="0"/>
+          <w:i/>
+          <w:color w:val="000000"/>
+          <w:sz w:val="24"/>
+        </w:rPr>
+        <w:t>Southeast Asia Mobile Game Market Insights 2025</w:t>
+      </w:r>
+      <w:r>
+        <w:rPr>
+          <w:rFonts w:ascii="Times New Roman" w:hAnsi="Times New Roman" w:cs="Times New Roman" w:eastAsia="Times New Roman"/>
+          <w:b w:val="0"/>
+          <w:i w:val="0"/>
+          <w:color w:val="000000"/>
+          <w:sz w:val="24"/>
+        </w:rPr>
+        <w:t xml:space="preserve"> (Kristianto, 2025), kawasan Asia Tenggara mencatatkan 1,93 miliar instalasi baru pada kuartal I 2025 dengan total pendapatan pembelian dalam aplikasi (</w:t>
+      </w:r>
+      <w:r>
+        <w:rPr>
+          <w:rFonts w:ascii="Times New Roman" w:hAnsi="Times New Roman" w:cs="Times New Roman" w:eastAsia="Times New Roman"/>
+          <w:b w:val="0"/>
+          <w:i/>
+          <w:color w:val="000000"/>
+          <w:sz w:val="24"/>
+        </w:rPr>
         <w:t>in-app purchase</w:t>
       </w:r>
       <w:r>
@@ -1300,7 +1367,7 @@
           <w:color w:val="000000"/>
           <w:sz w:val="24"/>
         </w:rPr>
-        <w:t>) 625 juta dolar AS pada kuartal I 2025 pada seksi pembuka. Pada seksi "Indonesia Leads Downloads" blog yang sama mencatat Indonesia 870 juta unduhan (+9 persen kuartal lawan kuartal) sebagai pemimpin Asia Tenggara. Blog tersebut menyebut Mobile Legends sebagai contoh lokalisasi-hiper (</w:t>
+        <w:t>) mencapai 625 juta dolar AS. Di tingkat regional, Indonesia tampil sebagai pasar terdepan dengan torehan 870 juta unduhan (tumbuh 9 persen dibandingkan kuartal sebelumnya). Laporan tersebut secara khusus menyoroti Mobile Legends sebagai contoh unggulan strategi lokalisasi konten (</w:t>
       </w:r>
       <w:r>
         <w:rPr>
@@ -1320,7 +1387,7 @@
           <w:color w:val="000000"/>
           <w:sz w:val="24"/>
         </w:rPr>
-        <w:t>) — konten budaya, karakter cerita rakyat (</w:t>
+        <w:t>), seperti pengadopsian unsur budaya dan karakter cerita rakyat (</w:t>
       </w:r>
       <w:r>
         <w:rPr>
@@ -1340,47 +1407,7 @@
           <w:color w:val="000000"/>
           <w:sz w:val="24"/>
         </w:rPr>
-        <w:t>), turnamen lokal, dan pembangunan komunitas (</w:t>
-      </w:r>
-      <w:r>
-        <w:rPr>
-          <w:rFonts w:ascii="Times New Roman" w:hAnsi="Times New Roman" w:cs="Times New Roman" w:eastAsia="Times New Roman"/>
-          <w:b w:val="0"/>
-          <w:i/>
-          <w:color w:val="000000"/>
-          <w:sz w:val="24"/>
-        </w:rPr>
-        <w:t>community building</w:t>
-      </w:r>
-      <w:r>
-        <w:rPr>
-          <w:rFonts w:ascii="Times New Roman" w:hAnsi="Times New Roman" w:cs="Times New Roman" w:eastAsia="Times New Roman"/>
-          <w:b w:val="0"/>
-          <w:i w:val="0"/>
-          <w:color w:val="000000"/>
-          <w:sz w:val="24"/>
-        </w:rPr>
-        <w:t>) termasuk contoh kampanye Ramadan di Indonesia — tanpa memberi angka pemain Mobile Legends Indonesia. Konteks global sebagai pembanding, bukan bukti nasional, adalah artikel Newzoo Key Numbers tertanggal 25 Agustus 2026 (penerbit Newzoo, konteks GLOBAL, model estimasi + riset konsumen, tgl akses 2026-10-01): ramalan (</w:t>
-      </w:r>
-      <w:r>
-        <w:rPr>
-          <w:rFonts w:ascii="Times New Roman" w:hAnsi="Times New Roman" w:cs="Times New Roman" w:eastAsia="Times New Roman"/>
-          <w:b w:val="0"/>
-          <w:i/>
-          <w:color w:val="000000"/>
-          <w:sz w:val="24"/>
-        </w:rPr>
-        <w:t>forecast</w:t>
-      </w:r>
-      <w:r>
-        <w:rPr>
-          <w:rFonts w:ascii="Times New Roman" w:hAnsi="Times New Roman" w:cs="Times New Roman" w:eastAsia="Times New Roman"/>
-          <w:b w:val="0"/>
-          <w:i w:val="0"/>
-          <w:color w:val="000000"/>
-          <w:sz w:val="24"/>
-        </w:rPr>
-        <w:t>, bukan realisasi) pasar global 2026 sebesar 213,9 miliar dolar AS (+6,1 persen tahun lawan tahun) dengan porsi seluler 121,1 miliar dolar AS (+6,8 persen), serta 3,7 miliar pemain global. Angka global ini dilarang dibaca sebagai angka Indonesia.</w:t>
+        <w:t>) lokal, penyelenggaraan turnamen berjenjang, hingga kampanye tematik komunitas seperti edisi Ramadan di Indonesia. Dalam lanskap global, Newzoo (2026) memproyeksikan industri permainan daring dunia mencapai nilai pasar sebesar 213,9 miliar dolar AS dengan segmen seluler mendominasi sebesar 121,1 miliar dolar AS serta melibatkan lebih dari 3,7 miliar pemain aktif. Tingginya angka unduhan dan lokalisasi di Indonesia mengonfirmasi bahwa ekosistem permainan seluler telah menjadi bagian integral dari gaya hidup digital generasi muda.</w:t>
       </w:r>
     </w:p>
     <w:p>
@@ -1398,7 +1425,7 @@
           <w:color w:val="000000"/>
           <w:sz w:val="24"/>
         </w:rPr>
-        <w:t>Konteks ketiga adalah liga dan kanal resmi yang berjalan. Laman resmi id-mpl.com (penerbit MPL Indonesia, tgl akses 2026-10-01, observasi struktur berjalan) memuat Regular Season S18 pada 14 Agustus–18 Oktober 2026 pada seksi FAQ, lokasi XO Hall Tanjung Duren Jakarta Barat, 9 tim S18 (TLID, AE, NAVI, EVOS, BTR, ONIC, DEWA, RRQ, GEEK) pada seksi peringkat, serta hadiah Rp5 miliar per musim pada seksi Tentang Kami. Laman arsip id-mpl.com/en/mpljourney (tgl akses 2026-10-01) menampilkan banner juara S1–S17 sebagai bukti kontinuitas 17 musim. Siaran MOONTON News tertanggal 25 Maret 2026 (URL en.moonton.com/news/318.html, tgl akses 2026-10-01, siaran penyelenggara) memuat Regular Season S17 pada 27 Maret–24 Mei 2026 dengan 9 tim yang sama. Klaim skala penonton pada seksi Tentang Kami id-mpl.com berbunyi S15 4,1 juta penonton live concurrent dan S12 lebih dari 100 juta jam tayang satu musim; keduanya berstatus klaim penyelenggara (</w:t>
+        <w:t xml:space="preserve">Konteks ketiga adalah konsistensi ekosistem liga profesional dan saluran resmi permainan. Penyelenggaraan kompetisi resmi </w:t>
       </w:r>
       <w:r>
         <w:rPr>
@@ -1408,17 +1435,17 @@
           <w:color w:val="000000"/>
           <w:sz w:val="24"/>
         </w:rPr>
-        <w:t>self-reported</w:t>
-      </w:r>
-      <w:r>
-        <w:rPr>
-          <w:rFonts w:ascii="Times New Roman" w:hAnsi="Times New Roman" w:cs="Times New Roman" w:eastAsia="Times New Roman"/>
-          <w:b w:val="0"/>
-          <w:i w:val="0"/>
-          <w:color w:val="000000"/>
-          <w:sz w:val="24"/>
-        </w:rPr>
-        <w:t xml:space="preserve">, definisi </w:t>
+        <w:t>Mobile Legends Professional League Indonesia</w:t>
+      </w:r>
+      <w:r>
+        <w:rPr>
+          <w:rFonts w:ascii="Times New Roman" w:hAnsi="Times New Roman" w:cs="Times New Roman" w:eastAsia="Times New Roman"/>
+          <w:b w:val="0"/>
+          <w:i w:val="0"/>
+          <w:color w:val="000000"/>
+          <w:sz w:val="24"/>
+        </w:rPr>
+        <w:t xml:space="preserve"> (MPL ID) telah berlangsung secara berkesinambungan hingga musim kedelapan belas (MPL Indonesia, 2026). Kompetisi ini diikuti oleh sembilan tim profesional papan atas nasional dan menyediakan total hadiah miliaran rupiah per musimnya, yang secara rutin menarik jutaan penonton siaran langsung (</w:t>
       </w:r>
       <w:r>
         <w:rPr>
@@ -1428,17 +1455,17 @@
           <w:color w:val="000000"/>
           <w:sz w:val="24"/>
         </w:rPr>
-        <w:t>viewership</w:t>
-      </w:r>
-      <w:r>
-        <w:rPr>
-          <w:rFonts w:ascii="Times New Roman" w:hAnsi="Times New Roman" w:cs="Times New Roman" w:eastAsia="Times New Roman"/>
-          <w:b w:val="0"/>
-          <w:i w:val="0"/>
-          <w:color w:val="000000"/>
-          <w:sz w:val="24"/>
-        </w:rPr>
-        <w:t xml:space="preserve"> tidak dirinci di homepage, metrik tayang streaming, bukan jumlah pemain). Laman MOONTON About Us (tgl akses 2026-10-01, klaim penyelenggara GLOBAL) menulis klaim lebih dari 1,5 miliar instalasi dan pengguna aktif bulanan (</w:t>
+        <w:t>concurrent viewers</w:t>
+      </w:r>
+      <w:r>
+        <w:rPr>
+          <w:rFonts w:ascii="Times New Roman" w:hAnsi="Times New Roman" w:cs="Times New Roman" w:eastAsia="Times New Roman"/>
+          <w:b w:val="0"/>
+          <w:i w:val="0"/>
+          <w:color w:val="000000"/>
+          <w:sz w:val="24"/>
+        </w:rPr>
+        <w:t>) serta ratusan juta jam penayangan turnamen. Dari sisi skala pengguna dan jangkauan produk, MOONTON (2026) mencatat lebih dari 1,5 miliar unduhan secara global serta melayani lebih dari 110 juta pengguna aktif bulanan (</w:t>
       </w:r>
       <w:r>
         <w:rPr>
@@ -1458,7 +1485,7 @@
           <w:color w:val="000000"/>
           <w:sz w:val="24"/>
         </w:rPr>
-        <w:t>) lebih dari 110 juta serta 10 besar paling dimainkan di lebih dari 80 negara. Listing Google Play com.mobile.legends (tgl akses 2026-10-01, region gl=UK, observasi bucket toko GLOBAL) mencatat tier 500M+ Downloads (bucket, bukan angka presisi), peringkat 3,9 bintang dengan 39 juta ulasan pada header dan 37,8 juta ulasan pada seksi rating (fluktuatif, catat keduanya), pengembang YoungJoy Technology Limited, pembaruan 22 September 2026. Listing App Store id1160056295 storefront GE (tgl akses 2026-10-01, per-storefront, bukan Indonesia) mencatat 4,7 dari 2,9 ribu rating, Chart No.17 Strategy, usia 13+, versi 2.2.16.1232.1 tanggal 16 September. Seluruh metrik toko bersifat GLOBAL atau per-storefront dan dilarang dipakai sebagai proksi populasi Generasi Z Indonesia.</w:t>
+        <w:t>) di berbagai negara. Di toko aplikasi digital seperti Google Play Store dan Apple App Store, Mobile Legends secara konsisten menempati peringkat teratas kategori strategi dan laga dengan ratusan juta unduhan serta puluhan juta ulasan pengguna. Eksistensi liga yang mapan dan komunitas yang aktif menunjukkan bahwa Mobile Legends bukan sekadar fenomena sesaat, melainkan ekosistem digital yang hidup dan memiliki daya tarik berkelanjutan.</w:t>
       </w:r>
     </w:p>
     <w:p>
@@ -1476,7 +1503,67 @@
           <w:color w:val="000000"/>
           <w:sz w:val="24"/>
         </w:rPr>
-        <w:t>Triangulasi di atas menghasilkan inferensi urgensi, bukan fakta penetrasi. Basis konektivitas nasional besar, skala permainan seluler dengan sinyal lokalisasi Indonesia kuat, dan liga nasional yang berjalan multi-musim membuat pertanyaan "mengapa Generasi Z berniat bermain Mobile Legends" layak diuji secara pemasaran. Tidak ada satu pun sumber T1 pada ledger yang memberi fakta berbentuk "X persen Generasi Z Indonesia bermain Mobile Legends". Status E01 tetap inference (proposed). Narasi urgensi wajib ditulis ulang apabila PDF primer APJII/BPS mematahkan basis konektivitas, MOONTON merevisi klaim instalasi/pengguna aktif, terbukti MPL Indonesia berhenti, atau ditemukan survei nasional yang menunjukkan penetrasi rendah.</w:t>
+        <w:t>Sintesis dari ketiga konteks di atas menegaskan urgensi penelitian ini dari perspektif manajemen pemasaran. Kuatnya fondasi infrastruktur digital Generasi Z, besarnya pasar permainan seluler di Indonesia, serta keberlanjutan ekosistem kompetitif Mobile Legends membuktikan bahwa keterlibatan generasi muda dalam permainan ini memiliki relevansi praktis yang nyata. Namun demikian, tingginya penetrasi digital dan popularitas permainan tidak serta-merta menjamin timbulnya minat bermain pada setiap individu. Oleh karena itu, penelitian mengenai faktor-faktor yang mendorong niat Generasi Z untuk memainkan Mobile Legends—baik dari sisi persuasi komunikator (</w:t>
+      </w:r>
+      <w:r>
+        <w:rPr>
+          <w:rFonts w:ascii="Times New Roman" w:hAnsi="Times New Roman" w:cs="Times New Roman" w:eastAsia="Times New Roman"/>
+          <w:b w:val="0"/>
+          <w:i/>
+          <w:color w:val="000000"/>
+          <w:sz w:val="24"/>
+        </w:rPr>
+        <w:t>influencer marketing</w:t>
+      </w:r>
+      <w:r>
+        <w:rPr>
+          <w:rFonts w:ascii="Times New Roman" w:hAnsi="Times New Roman" w:cs="Times New Roman" w:eastAsia="Times New Roman"/>
+          <w:b w:val="0"/>
+          <w:i w:val="0"/>
+          <w:color w:val="000000"/>
+          <w:sz w:val="24"/>
+        </w:rPr>
+        <w:t>), pengaruh percakapan komunitas daring (</w:t>
+      </w:r>
+      <w:r>
+        <w:rPr>
+          <w:rFonts w:ascii="Times New Roman" w:hAnsi="Times New Roman" w:cs="Times New Roman" w:eastAsia="Times New Roman"/>
+          <w:b w:val="0"/>
+          <w:i/>
+          <w:color w:val="000000"/>
+          <w:sz w:val="24"/>
+        </w:rPr>
+        <w:t>electronic word-of-mouth</w:t>
+      </w:r>
+      <w:r>
+        <w:rPr>
+          <w:rFonts w:ascii="Times New Roman" w:hAnsi="Times New Roman" w:cs="Times New Roman" w:eastAsia="Times New Roman"/>
+          <w:b w:val="0"/>
+          <w:i w:val="0"/>
+          <w:color w:val="000000"/>
+          <w:sz w:val="24"/>
+        </w:rPr>
+        <w:t>), maupun pengalaman kenikmatan bermain (</w:t>
+      </w:r>
+      <w:r>
+        <w:rPr>
+          <w:rFonts w:ascii="Times New Roman" w:hAnsi="Times New Roman" w:cs="Times New Roman" w:eastAsia="Times New Roman"/>
+          <w:b w:val="0"/>
+          <w:i/>
+          <w:color w:val="000000"/>
+          <w:sz w:val="24"/>
+        </w:rPr>
+        <w:t>perceived enjoyment</w:t>
+      </w:r>
+      <w:r>
+        <w:rPr>
+          <w:rFonts w:ascii="Times New Roman" w:hAnsi="Times New Roman" w:cs="Times New Roman" w:eastAsia="Times New Roman"/>
+          <w:b w:val="0"/>
+          <w:i w:val="0"/>
+          <w:color w:val="000000"/>
+          <w:sz w:val="24"/>
+        </w:rPr>
+        <w:t>)—menjadi topik riset yang sangat penting, aktual, dan bernilai strategis bagi pengembangan strategi pemasaran digital.</w:t>
       </w:r>
     </w:p>
     <w:p>
@@ -1514,7 +1601,27 @@
           <w:color w:val="000000"/>
           <w:sz w:val="24"/>
         </w:rPr>
-        <w:t>) disusun pada tiga jalur dengan pola yang sama: temuan positif (A) berhadapan dengan temuan kontra atau parsial (B), lalu penjelasan mengapa hasilnya pecah (The Why).</w:t>
+        <w:t>) disusun pada tiga jalur dengan pola yang sama: temuan positif (A) berhadapan dengan temuan kontra atau parsial (B), lalu penjelasan mengapa hasilnya berbeda (</w:t>
+      </w:r>
+      <w:r>
+        <w:rPr>
+          <w:rFonts w:ascii="Times New Roman" w:hAnsi="Times New Roman" w:cs="Times New Roman" w:eastAsia="Times New Roman"/>
+          <w:b w:val="0"/>
+          <w:i/>
+          <w:color w:val="000000"/>
+          <w:sz w:val="24"/>
+        </w:rPr>
+        <w:t>the why</w:t>
+      </w:r>
+      <w:r>
+        <w:rPr>
+          <w:rFonts w:ascii="Times New Roman" w:hAnsi="Times New Roman" w:cs="Times New Roman" w:eastAsia="Times New Roman"/>
+          <w:b w:val="0"/>
+          <w:i w:val="0"/>
+          <w:color w:val="000000"/>
+          <w:sz w:val="24"/>
+        </w:rPr>
+        <w:t>).</w:t>
       </w:r>
     </w:p>
     <w:p>
@@ -1552,7 +1659,7 @@
           <w:color w:val="000000"/>
           <w:sz w:val="24"/>
         </w:rPr>
-        <w:t>) ke intensi, temuan A positif berasal dari Octaviani dan Hartono (2023) pada pengguna Instagram Indonesia (N = 180) bahwa kredibilitas dan nilai infotainment membentuk nilai iklan (</w:t>
+        <w:t>) ke intensi, temuan A positif berasal dari Octaviani dan Hartono (2023) terhadap 180 responden pengguna Instagram di Indonesia bahwa kredibilitas dan nilai infotainment membentuk nilai iklan (</w:t>
       </w:r>
       <w:r>
         <w:rPr>
@@ -1592,7 +1699,7 @@
           <w:color w:val="000000"/>
           <w:sz w:val="24"/>
         </w:rPr>
-        <w:t xml:space="preserve"> (2020) pada pengguna Instagram Jerman usia 18–34 (N = 306) bahwa daya tarik, kepercayaan, dan keahlian (</w:t>
+        <w:t xml:space="preserve"> (2020) pada 306 responden pengguna Instagram usia 18–34 tahun di Jerman bahwa daya tarik, kepercayaan, dan keahlian (</w:t>
       </w:r>
       <w:r>
         <w:rPr>
@@ -1632,7 +1739,7 @@
           <w:color w:val="000000"/>
           <w:sz w:val="24"/>
         </w:rPr>
-        <w:t>) hanya bekerja tidak langsung via daya tarik; serta Bevan-Dye dan Motaung (2023) pada mahasiswa Gen Y Afrika Selatan (N = 334) bahwa nilai informatif, nilai hiburan, dan kepercayaan membentuk persepsi utilitas lalu predisposisi merek. Temuan B kontra berasal dari Putri dan Tiarawati (2021) pada pengikut Instagram Indonesia (N = 211) bahwa influencer tidak berpengaruh positif-signifikan dan citra merek (</w:t>
+        <w:t>) hanya bekerja tidak langsung via daya tarik; serta Bevan-Dye dan Motaung (2023) terhadap 334 mahasiswa Generasi Y di Afrika Selatan bahwa nilai informatif, nilai hiburan, dan kepercayaan membentuk persepsi utilitas lalu predisposisi merek. Temuan B kontra berasal dari Putri dan Tiarawati (2021) terhadap 211 responden pengikut akun Instagram di Indonesia bahwa influencer tidak berpengaruh positif-signifikan dan citra merek (</w:t>
       </w:r>
       <w:r>
         <w:rPr>
@@ -1672,7 +1779,7 @@
           <w:color w:val="000000"/>
           <w:sz w:val="24"/>
         </w:rPr>
-        <w:t xml:space="preserve"> (2025) pada pelanggan kosmetik Indonesia (N = 290) bahwa pengaruh langsung kredibilitas dan konten persuasif ke intensi positif tetapi tidak signifikan dan baru positif-signifikan secara tidak langsung via sikap pelanggan (</w:t>
+        <w:t xml:space="preserve"> (2025) terhadap 290 konsumen produk kosmetik di Indonesia bahwa pengaruh langsung kredibilitas dan konten persuasif ke intensi positif tetapi tidak signifikan dan baru positif-signifikan secara tidak langsung via sikap pelanggan (</w:t>
       </w:r>
       <w:r>
         <w:rPr>
@@ -1692,7 +1799,7 @@
           <w:color w:val="000000"/>
           <w:sz w:val="24"/>
         </w:rPr>
-        <w:t>, mediasi penuh). The Why X1: kredibilitas saja tidak cukup; pengaruh perlu jembatan sikap, nilai iklan, atau citra merek, serta pengetahuan persuasi (</w:t>
+        <w:t>, mediasi penuh). Penjelasan perbedaan hasil pada jalur X1 (</w:t>
       </w:r>
       <w:r>
         <w:rPr>
@@ -1702,6 +1809,26 @@
           <w:color w:val="000000"/>
           <w:sz w:val="24"/>
         </w:rPr>
+        <w:t>the why</w:t>
+      </w:r>
+      <w:r>
+        <w:rPr>
+          <w:rFonts w:ascii="Times New Roman" w:hAnsi="Times New Roman" w:cs="Times New Roman" w:eastAsia="Times New Roman"/>
+          <w:b w:val="0"/>
+          <w:i w:val="0"/>
+          <w:color w:val="000000"/>
+          <w:sz w:val="24"/>
+        </w:rPr>
+        <w:t>) menunjukkan bahwa kredibilitas komunikator semata tidak selalu cukup; pengaruh persuasif sering kali membutuhkan mediasi sikap atau nilai iklan, di samping adanya kesadaran persuasi (</w:t>
+      </w:r>
+      <w:r>
+        <w:rPr>
+          <w:rFonts w:ascii="Times New Roman" w:hAnsi="Times New Roman" w:cs="Times New Roman" w:eastAsia="Times New Roman"/>
+          <w:b w:val="0"/>
+          <w:i/>
+          <w:color w:val="000000"/>
+          <w:sz w:val="24"/>
+        </w:rPr>
         <w:t>persuasion knowledge</w:t>
       </w:r>
       <w:r>
@@ -1712,7 +1839,7 @@
           <w:color w:val="000000"/>
           <w:sz w:val="24"/>
         </w:rPr>
-        <w:t>) atas konten komersial dapat melemahkan efek langsung.</w:t>
+        <w:t>) audiens yang dapat memitigasi efektivitas pesan promosi secara langsung.</w:t>
       </w:r>
     </w:p>
     <w:p>
@@ -1770,7 +1897,7 @@
           <w:color w:val="000000"/>
           <w:sz w:val="24"/>
         </w:rPr>
-        <w:t xml:space="preserve"> (2022) pada mahasiswa Bangladesh (N = 432) bahwa kualitas dan kredibilitas informasi membentuk kemudahan dan kegunaan lalu adopsi (</w:t>
+        <w:t xml:space="preserve"> (2022) terhadap 432 mahasiswa di Bangladesh bahwa kualitas dan kredibilitas informasi membentuk kemudahan dan kegunaan lalu adopsi (</w:t>
       </w:r>
       <w:r>
         <w:rPr>
@@ -1830,7 +1957,7 @@
           <w:color w:val="000000"/>
           <w:sz w:val="24"/>
         </w:rPr>
-        <w:t xml:space="preserve"> (2022) pada pembeli Malaysia (N = 222) bahwa kualitas, kredibilitas, kesesuaian tugas (</w:t>
+        <w:t xml:space="preserve"> (2022) terhadap 222 konsumen di Malaysia bahwa kualitas, kredibilitas, kesesuaian tugas (</w:t>
       </w:r>
       <w:r>
         <w:rPr>
@@ -1870,7 +1997,7 @@
           <w:color w:val="000000"/>
           <w:sz w:val="24"/>
         </w:rPr>
-        <w:t>) tidak signifikan; serta Winarno dan Indrawati (2022) pada konsumen Indonesia (N = 300) bahwa pemasaran media sosial (</w:t>
+        <w:t>) tidak signifikan; serta Winarno dan Indrawati (2022) terhadap 300 konsumen di Indonesia bahwa pemasaran media sosial (</w:t>
       </w:r>
       <w:r>
         <w:rPr>
@@ -1910,7 +2037,7 @@
           <w:color w:val="000000"/>
           <w:sz w:val="24"/>
         </w:rPr>
-        <w:t xml:space="preserve"> (2024) pada Gen Z Vietnam pengguna media sosial (N = 280) bahwa kredibilitas tidak signifikan ke kegunaan/adopsi dan kuantitas tidak signifikan ke adopsi, sementara kualitas, kuantitas, dan kebutuhan menentukan kegunaan/adopsi secara campuran; serta Sastri dan Harsoyo (2023) pada konsumen Indonesia (N = 100, DOI UNVERIFIED — sitir dengan URL + label ini, jangan tulis DOI palsu) bahwa komunikasi elektronik dari mulut ke mulut tidak berpengaruh positif-signifikan ke keputusan pembelian dan berhenti pada tahap niat. The Why X2: kredibilitas saja tidak cukup bagi Gen Z; yang menggerakkan adalah kualitas, kuantitas, kebutuhan, dan kesesuaian tugas yang dinilai berguna lalu diadopsi, dengan pembeda tegas antara intensi dan keputusan serta gerbang kepercayaan (</w:t>
+        <w:t xml:space="preserve"> (2024) terhadap 280 responden Generasi Z pengguna media sosial di Vietnam bahwa kredibilitas tidak signifikan ke kegunaan/adopsi dan kuantitas tidak signifikan ke adopsi, sementara kualitas, kuantitas, dan kebutuhan menentukan kegunaan/adopsi secara campuran; serta Sastri dan Harsoyo (2023) terhadap 100 konsumen di Indonesia bahwa komunikasi elektronik dari mulut ke mulut tidak berpengaruh positif-signifikan ke keputusan pembelian dan berhenti pada tahap niat. Penjelasan perbedaan hasil pada jalur X2 (</w:t>
       </w:r>
       <w:r>
         <w:rPr>
@@ -1920,17 +2047,17 @@
           <w:color w:val="000000"/>
           <w:sz w:val="24"/>
         </w:rPr>
-        <w:t>trust</w:t>
-      </w:r>
-      <w:r>
-        <w:rPr>
-          <w:rFonts w:ascii="Times New Roman" w:hAnsi="Times New Roman" w:cs="Times New Roman" w:eastAsia="Times New Roman"/>
-          <w:b w:val="0"/>
-          <w:i w:val="0"/>
-          <w:color w:val="000000"/>
-          <w:sz w:val="24"/>
-        </w:rPr>
-        <w:t>) dan adopsi informasi.</w:t>
+        <w:t>the why</w:t>
+      </w:r>
+      <w:r>
+        <w:rPr>
+          <w:rFonts w:ascii="Times New Roman" w:hAnsi="Times New Roman" w:cs="Times New Roman" w:eastAsia="Times New Roman"/>
+          <w:b w:val="0"/>
+          <w:i w:val="0"/>
+          <w:color w:val="000000"/>
+          <w:sz w:val="24"/>
+        </w:rPr>
+        <w:t>) menegaskan bahwa bagi Generasi Z, kredibilitas ulasan semata belum memadai jika kualitas dan relevansi kebutuhan informasi tidak terpenuhi, di samping adanya perbedaan mendasar antara pembentukan niat awal dengan keputusan tindakan akhir.</w:t>
       </w:r>
     </w:p>
     <w:p>
@@ -1968,7 +2095,7 @@
           <w:color w:val="000000"/>
           <w:sz w:val="24"/>
         </w:rPr>
-        <w:t>) ke intensi, temuan A positif berasal dari Bongso dan Dewi (2021) pada pemain permainan seluler Kota Kita Indonesia (N = 100) bahwa kenikmatan, pengaruh sosial (</w:t>
+        <w:t>) ke intensi, temuan A positif berasal dari Bongso dan Dewi (2021) terhadap 100 pemain permainan seluler Kota Kita di Indonesia bahwa kenikmatan, pengaruh sosial (</w:t>
       </w:r>
       <w:r>
         <w:rPr>
@@ -2028,7 +2155,7 @@
           <w:color w:val="000000"/>
           <w:sz w:val="24"/>
         </w:rPr>
-        <w:t>), ekspektasi kinerja, dan ekspektasi usaha tidak signifikan; Kurnia dan Sukarnadi (2023) pada pengguna permainan seluler Indonesia (Mobile Legend dan Free Fire disebut pada data deskriptif, N tidak diklaim) bahwa estetika desain, kemudahan, tantangan, variasi, kebaruan, dan interaktivitas membentuk kenikmatan lalu kenikmatan menggerakkan intensi kontinuitas dengan interaktivitas paling dominan (arah, bukan angka); Dewi (2022) pada pemain PUBG Mobile Indonesia milenial/Gen Z kuliah yang bermain lebih dari satu tahun (N = 223) bahwa kemudahan, kegunaan, sikap, dan kenikmatan menggerakkan niat bermain (</w:t>
+        <w:t>), ekspektasi kinerja, dan ekspektasi usaha tidak signifikan; Kurnia dan Sukarnadi (2023) pada pemain permainan seluler di Indonesia bahwa estetika desain, kemudahan, tantangan, variasi, kebaruan, dan interaktivitas secara positif membentuk kenikmatan yang selanjutnya mendorong niat bermain berkelanjutan dengan faktor interaktivitas sebagai pengaruh paling dominan; Dewi (2022) terhadap 223 pemain PUBG Mobile kalangan milenial dan Generasi Z di Indonesia bahwa kemudahan, kegunaan, sikap, dan kenikmatan menggerakkan niat bermain (</w:t>
       </w:r>
       <w:r>
         <w:rPr>
@@ -2068,7 +2195,7 @@
           <w:color w:val="000000"/>
           <w:sz w:val="24"/>
         </w:rPr>
-        <w:t xml:space="preserve"> (2020) pada pengguna permainan seluler Indonesia (N = 205) bahwa kemudahan, tantangan, kebaruan, estetika, dan interaksi sosial membentuk kenikmatan lalu kenikmatan menggerakkan intensi kontinuitas dengan pola campuran pada anteseden lain. Temuan B kontra-parsial berasal dari Pérez de Prado </w:t>
+        <w:t xml:space="preserve"> (2020) terhadap 205 pengguna permainan seluler di Indonesia bahwa kemudahan, tantangan, kebaruan, estetika, dan interaksi sosial membentuk kenikmatan lalu menggerakkan intensi kontinuitas. Temuan B kontra-parsial berasal dari Pérez de Prado </w:t>
       </w:r>
       <w:r>
         <w:rPr>
@@ -2088,7 +2215,7 @@
           <w:color w:val="000000"/>
           <w:sz w:val="24"/>
         </w:rPr>
-        <w:t xml:space="preserve"> (2021) pada pengguna permainan daring India (N = 304) bahwa persepsi kenikmatan tidak signifikan ke persepsi kegunaan dan sikap, sementara kegunaan, sikap, dan aliran yang menggerakkan intensi perilaku (</w:t>
+        <w:t xml:space="preserve"> (2021) terhadap 304 pengguna permainan daring di India bahwa persepsi kenikmatan tidak signifikan ke persepsi kegunaan dan sikap, sementara kegunaan, sikap, dan aliran yang menggerakkan intensi perilaku (</w:t>
       </w:r>
       <w:r>
         <w:rPr>
@@ -2108,7 +2235,27 @@
           <w:color w:val="000000"/>
           <w:sz w:val="24"/>
         </w:rPr>
-        <w:t>). The Why X3: kenikmatan bukan kegunaan; pada permainan hedonik kenikmatan menang atas ekspektasi kinerja/kemudahan, tetapi tidak semua fitur teknis/sosial otomatis menjadi kenikmatan — kebaruan, tantangan, interaktivitas, dan estetika yang dominan.</w:t>
+        <w:t>). Penjelasan perbedaan hasil pada jalur X3 (</w:t>
+      </w:r>
+      <w:r>
+        <w:rPr>
+          <w:rFonts w:ascii="Times New Roman" w:hAnsi="Times New Roman" w:cs="Times New Roman" w:eastAsia="Times New Roman"/>
+          <w:b w:val="0"/>
+          <w:i/>
+          <w:color w:val="000000"/>
+          <w:sz w:val="24"/>
+        </w:rPr>
+        <w:t>the why</w:t>
+      </w:r>
+      <w:r>
+        <w:rPr>
+          <w:rFonts w:ascii="Times New Roman" w:hAnsi="Times New Roman" w:cs="Times New Roman" w:eastAsia="Times New Roman"/>
+          <w:b w:val="0"/>
+          <w:i w:val="0"/>
+          <w:color w:val="000000"/>
+          <w:sz w:val="24"/>
+        </w:rPr>
+        <w:t>) mengindikasikan bahwa pada produk permainan yang bersifat hedonik, motivasi kenikmatan intrinsik memegang peranan lebih dominan daripada nilai kemanfaatan fungsional, meskipun tidak semua atribut teknis secara otomatis berhasil dikonversi menjadi rasa kenikmatan oleh pemain.</w:t>
       </w:r>
     </w:p>
     <w:p>
@@ -2126,7 +2273,7 @@
           <w:color w:val="000000"/>
           <w:sz w:val="24"/>
         </w:rPr>
-        <w:t>Pola lintas jalur menegaskan pembenar model integratif: efek langsung X ke Y sering pecah oleh mekanisme. X1 pecah oleh sikap/nilai iklan/citra merek; X2 pecah oleh kegunaan/adopsi/kepercayaan dan beda niat lawan keputusan; X3 pecah oleh anteseden permainan dan beda hedonik lawan utilitarian. Belum ditemukan satu studi terverifikasi yang menguji X1 + X2 + X3 secara simultan terhadap niat bermain Mobile Legends pada Generasi Z nasional. Studi permainan terverifikasi memakai subset (PUBG + kenikmatan, Kota Kita + kenikmatan, anteseden kenikmatan umum, atau model penerimaan teknologi India), sedangkan studi influencer/komunikasi elektronik memakai objek kosmetik, fesyen, e-commerce, bubble tea, atau kendaraan. Konteks Generasi Z Indonesia + Mobile Legends (MOBA interaktif, kompetitif, sosial) belum terisi. Ini kebaruan (</w:t>
+        <w:t>Pola lintas jalur menegaskan pembenar model integratif: efek langsung X ke Y sering kali bervariasi bergantung pada konteks industri dan karakteristik audiens. Sejauh penelusuran literatur yang dilakukan, belum ditemukan satu studi empiris yang menguji pengaruh langsung X1, X2, dan X3 secara terintegrasi dalam satu model terhadap niat bermain Mobile Legends pada Generasi Z di Indonesia. Studi-studi terdahulu umumnya menguji variabel-variabel tersebut secara terpisah pada objek game yang berbeda atau pada komoditas non-game seperti fesyen dan kosmetik. Oleh karena itu, penelitian ini menawarkan kebaruan kontekstual (</w:t>
       </w:r>
       <w:r>
         <w:rPr>
@@ -2136,17 +2283,17 @@
           <w:color w:val="000000"/>
           <w:sz w:val="24"/>
         </w:rPr>
-        <w:t>novelty</w:t>
-      </w:r>
-      <w:r>
-        <w:rPr>
-          <w:rFonts w:ascii="Times New Roman" w:hAnsi="Times New Roman" w:cs="Times New Roman" w:eastAsia="Times New Roman"/>
-          <w:b w:val="0"/>
-          <w:i w:val="0"/>
-          <w:color w:val="000000"/>
-          <w:sz w:val="24"/>
-        </w:rPr>
-        <w:t>) kombinasi + konteks, bukan konstruk baru.</w:t>
+        <w:t>contextual novelty</w:t>
+      </w:r>
+      <w:r>
+        <w:rPr>
+          <w:rFonts w:ascii="Times New Roman" w:hAnsi="Times New Roman" w:cs="Times New Roman" w:eastAsia="Times New Roman"/>
+          <w:b w:val="0"/>
+          <w:i w:val="0"/>
+          <w:color w:val="000000"/>
+          <w:sz w:val="24"/>
+        </w:rPr>
+        <w:t>) yang kuat dengan mengintegrasikan ketiga variabel prediktor tersebut pada ekosistem permainan MOBA terpopuler di kalangan Generasi Z Indonesia.</w:t>
       </w:r>
     </w:p>
     <w:p>
@@ -2242,7 +2389,7 @@
           <w:color w:val="000000"/>
           <w:sz w:val="24"/>
         </w:rPr>
-        <w:t>Tujuan penelitian versi ringkas adalah menguji pengaruh parsial X1, X2, X3 terhadap Y serta pengaruh simultan ketiganya, pada Generasi Z Indonesia dengan objek Mobile Legends memakai data primer kuesioner. Kontribusi penulis adalah (1) menguji tiga pendorong dalam satu kerangka niat bermain permainan hedonik sehingga efek parsial dan simultan terbaca bersama, (2) memberi bukti konteks Generasi Z Indonesia + Mobile Legends yang belum terisi, dan (3) mendokumentasikan mekanisme mediasi (sikap, nilai iklan, kegunaan, adopsi, kepercayaan) sebagai agenda lanjutan tanpa mengklaimnya diuji apabila kuesioner hanya model langsung (</w:t>
+        <w:t>Tujuan penelitian versi ringkas adalah menguji pengaruh langsung masing-masing variabel X1, X2, dan X3 terhadap Y, pada Generasi Z Indonesia dengan objek Mobile Legends memakai data primer kuesioner. Kontribusi penulis adalah (1) menguji tiga pendorong dalam satu kerangka niat bermain permainan hedonik sehingga efek masing-masing prediktor dapat dianalisis secara komprehensif, (2) memberi bukti konteks Generasi Z Indonesia dengan Mobile Legends yang belum terisi, dan (3) mendokumentasikan mekanisme mediasi (sikap, nilai iklan, kegunaan, adopsi, kepercayaan) sebagai agenda lanjutan tanpa mengklaimnya diuji apabila kuesioner hanya model langsung (</w:t>
       </w:r>
       <w:r>
         <w:rPr>
@@ -2300,7 +2447,7 @@
           <w:color w:val="000000"/>
           <w:sz w:val="24"/>
         </w:rPr>
-        <w:t xml:space="preserve"> (2024) pada investor muda Indonesia usia 18–30 di BEI (N = 344) menguji kecanggihan investor dan pengaruh media sosial ke persepsi return lalu kepuasan investasi, dengan hasil pengaruh media sosial ke kepuasan tidak langsung (mediasi penuh via return). Kedekatan hanya tematik — subjek muda seumur Generasi Z, ada variabel pengaruh media sosial, pola mediasi penuh yang paralel dengan sikap/nilai iklan pada S05/S01 — dan dinyatakan TERBUKA tidak dipaksa sebagai landasan hipotesis permainan. Karya pemasaran FEB yang relevan langsung dengan permainan/MLBB masih TERBUKA tidak ditemukan pada penelusuran sesi matriks.</w:t>
+        <w:t xml:space="preserve"> (2024) terhadap 344 investor muda berusia 18–30 tahun di Bursa Efek Indonesia menguji kecanggihan investor dan pengaruh media sosial ke persepsi return lalu kepuasan investasi, dengan hasil pengaruh media sosial ke kepuasan tidak langsung (mediasi penuh via return). Kedekatan hanya tematik — subjek muda seumur Generasi Z, ada variabel pengaruh media sosial, pola mediasi penuh yang paralel dengan sikap/nilai iklan pada S05/S01 — dan dinyatakan TERBUKA tidak dipaksa sebagai landasan hipotesis permainan. Karya pemasaran FEB yang relevan langsung dengan permainan/MLBB masih TERBUKA tidak ditemukan pada penelusuran sesi matriks.</w:t>
       </w:r>
     </w:p>
     <w:p>
@@ -2500,6 +2647,30 @@
     </w:p>
     <w:p>
       <w:pPr>
+        <w:pStyle w:val="Heading2"/>
+        <w:jc w:val="left"/>
+      </w:pPr>
+      <w:r>
+        <w:rPr>
+          <w:rFonts w:ascii="Times New Roman" w:hAnsi="Times New Roman" w:cs="Times New Roman" w:eastAsia="Times New Roman"/>
+          <w:b/>
+          <w:color w:val="000000"/>
+          <w:sz w:val="24"/>
+        </w:rPr>
+      </w:r>
+      <w:r>
+        <w:rPr>
+          <w:rFonts w:ascii="Times New Roman" w:hAnsi="Times New Roman" w:cs="Times New Roman" w:eastAsia="Times New Roman"/>
+          <w:b/>
+          <w:i w:val="0"/>
+          <w:color w:val="000000"/>
+          <w:sz w:val="24"/>
+        </w:rPr>
+        <w:t>1.3 Tujuan Penelitian</w:t>
+      </w:r>
+    </w:p>
+    <w:p>
+      <w:pPr>
         <w:spacing w:line="360" w:lineRule="auto" w:before="0" w:after="0"/>
         <w:ind w:left="709" w:hanging="227"/>
         <w:jc w:val="both"/>
@@ -2512,7 +2683,7 @@
           <w:color w:val="000000"/>
           <w:sz w:val="24"/>
         </w:rPr>
-        <w:t>4. Apakah pemasaran influencer (</w:t>
+        <w:t>1. Untuk menguji pengaruh pemasaran influencer (</w:t>
       </w:r>
       <w:r>
         <w:rPr>
@@ -2532,7 +2703,7 @@
           <w:color w:val="000000"/>
           <w:sz w:val="24"/>
         </w:rPr>
-        <w:t>), komunikasi elektronik dari mulut ke mulut (</w:t>
+        <w:t>) terhadap niat bermain (</w:t>
       </w:r>
       <w:r>
         <w:rPr>
@@ -2542,46 +2713,6 @@
           <w:color w:val="000000"/>
           <w:sz w:val="24"/>
         </w:rPr>
-        <w:t>electronic word-of-mouth</w:t>
-      </w:r>
-      <w:r>
-        <w:rPr>
-          <w:rFonts w:ascii="Times New Roman" w:hAnsi="Times New Roman" w:cs="Times New Roman" w:eastAsia="Times New Roman"/>
-          <w:b w:val="0"/>
-          <w:i w:val="0"/>
-          <w:color w:val="000000"/>
-          <w:sz w:val="24"/>
-        </w:rPr>
-        <w:t>), dan persepsi kenikmatan (</w:t>
-      </w:r>
-      <w:r>
-        <w:rPr>
-          <w:rFonts w:ascii="Times New Roman" w:hAnsi="Times New Roman" w:cs="Times New Roman" w:eastAsia="Times New Roman"/>
-          <w:b w:val="0"/>
-          <w:i/>
-          <w:color w:val="000000"/>
-          <w:sz w:val="24"/>
-        </w:rPr>
-        <w:t>perceived enjoyment</w:t>
-      </w:r>
-      <w:r>
-        <w:rPr>
-          <w:rFonts w:ascii="Times New Roman" w:hAnsi="Times New Roman" w:cs="Times New Roman" w:eastAsia="Times New Roman"/>
-          <w:b w:val="0"/>
-          <w:i w:val="0"/>
-          <w:color w:val="000000"/>
-          <w:sz w:val="24"/>
-        </w:rPr>
-        <w:t>) secara simultan berpengaruh positif terhadap niat bermain (</w:t>
-      </w:r>
-      <w:r>
-        <w:rPr>
-          <w:rFonts w:ascii="Times New Roman" w:hAnsi="Times New Roman" w:cs="Times New Roman" w:eastAsia="Times New Roman"/>
-          <w:b w:val="0"/>
-          <w:i/>
-          <w:color w:val="000000"/>
-          <w:sz w:val="24"/>
-        </w:rPr>
         <w:t>intention to play</w:t>
       </w:r>
       <w:r>
@@ -2592,31 +2723,7 @@
           <w:color w:val="000000"/>
           <w:sz w:val="24"/>
         </w:rPr>
-        <w:t>) Mobile Legends pada Generasi Z di Indonesia?</w:t>
-      </w:r>
-    </w:p>
-    <w:p>
-      <w:pPr>
-        <w:pStyle w:val="Heading2"/>
-        <w:jc w:val="left"/>
-      </w:pPr>
-      <w:r>
-        <w:rPr>
-          <w:rFonts w:ascii="Times New Roman" w:hAnsi="Times New Roman" w:cs="Times New Roman" w:eastAsia="Times New Roman"/>
-          <w:b/>
-          <w:color w:val="000000"/>
-          <w:sz w:val="24"/>
-        </w:rPr>
-      </w:r>
-      <w:r>
-        <w:rPr>
-          <w:rFonts w:ascii="Times New Roman" w:hAnsi="Times New Roman" w:cs="Times New Roman" w:eastAsia="Times New Roman"/>
-          <w:b/>
-          <w:i w:val="0"/>
-          <w:color w:val="000000"/>
-          <w:sz w:val="24"/>
-        </w:rPr>
-        <w:t>1.3 Tujuan Penelitian</w:t>
+        <w:t>) Mobile Legends pada Generasi Z di Indonesia.</w:t>
       </w:r>
     </w:p>
     <w:p>
@@ -2633,7 +2740,7 @@
           <w:color w:val="000000"/>
           <w:sz w:val="24"/>
         </w:rPr>
-        <w:t>1. Untuk menguji pengaruh pemasaran influencer (</w:t>
+        <w:t>2. Untuk menguji pengaruh komunikasi elektronik dari mulut ke mulut (</w:t>
       </w:r>
       <w:r>
         <w:rPr>
@@ -2643,7 +2750,7 @@
           <w:color w:val="000000"/>
           <w:sz w:val="24"/>
         </w:rPr>
-        <w:t>influencer marketing</w:t>
+        <w:t>electronic word-of-mouth</w:t>
       </w:r>
       <w:r>
         <w:rPr>
@@ -2690,161 +2797,7 @@
           <w:color w:val="000000"/>
           <w:sz w:val="24"/>
         </w:rPr>
-        <w:t>2. Untuk menguji pengaruh komunikasi elektronik dari mulut ke mulut (</w:t>
-      </w:r>
-      <w:r>
-        <w:rPr>
-          <w:rFonts w:ascii="Times New Roman" w:hAnsi="Times New Roman" w:cs="Times New Roman" w:eastAsia="Times New Roman"/>
-          <w:b w:val="0"/>
-          <w:i/>
-          <w:color w:val="000000"/>
-          <w:sz w:val="24"/>
-        </w:rPr>
-        <w:t>electronic word-of-mouth</w:t>
-      </w:r>
-      <w:r>
-        <w:rPr>
-          <w:rFonts w:ascii="Times New Roman" w:hAnsi="Times New Roman" w:cs="Times New Roman" w:eastAsia="Times New Roman"/>
-          <w:b w:val="0"/>
-          <w:i w:val="0"/>
-          <w:color w:val="000000"/>
-          <w:sz w:val="24"/>
-        </w:rPr>
-        <w:t>) terhadap niat bermain (</w:t>
-      </w:r>
-      <w:r>
-        <w:rPr>
-          <w:rFonts w:ascii="Times New Roman" w:hAnsi="Times New Roman" w:cs="Times New Roman" w:eastAsia="Times New Roman"/>
-          <w:b w:val="0"/>
-          <w:i/>
-          <w:color w:val="000000"/>
-          <w:sz w:val="24"/>
-        </w:rPr>
-        <w:t>intention to play</w:t>
-      </w:r>
-      <w:r>
-        <w:rPr>
-          <w:rFonts w:ascii="Times New Roman" w:hAnsi="Times New Roman" w:cs="Times New Roman" w:eastAsia="Times New Roman"/>
-          <w:b w:val="0"/>
-          <w:i w:val="0"/>
-          <w:color w:val="000000"/>
-          <w:sz w:val="24"/>
-        </w:rPr>
-        <w:t>) Mobile Legends pada Generasi Z di Indonesia.</w:t>
-      </w:r>
-    </w:p>
-    <w:p>
-      <w:pPr>
-        <w:spacing w:line="360" w:lineRule="auto" w:before="0" w:after="0"/>
-        <w:ind w:left="709" w:hanging="227"/>
-        <w:jc w:val="both"/>
-      </w:pPr>
-      <w:r>
-        <w:rPr>
-          <w:rFonts w:ascii="Times New Roman" w:hAnsi="Times New Roman" w:cs="Times New Roman" w:eastAsia="Times New Roman"/>
-          <w:b w:val="0"/>
-          <w:i w:val="0"/>
-          <w:color w:val="000000"/>
-          <w:sz w:val="24"/>
-        </w:rPr>
         <w:t>3. Untuk menguji pengaruh persepsi kenikmatan (</w:t>
-      </w:r>
-      <w:r>
-        <w:rPr>
-          <w:rFonts w:ascii="Times New Roman" w:hAnsi="Times New Roman" w:cs="Times New Roman" w:eastAsia="Times New Roman"/>
-          <w:b w:val="0"/>
-          <w:i/>
-          <w:color w:val="000000"/>
-          <w:sz w:val="24"/>
-        </w:rPr>
-        <w:t>perceived enjoyment</w:t>
-      </w:r>
-      <w:r>
-        <w:rPr>
-          <w:rFonts w:ascii="Times New Roman" w:hAnsi="Times New Roman" w:cs="Times New Roman" w:eastAsia="Times New Roman"/>
-          <w:b w:val="0"/>
-          <w:i w:val="0"/>
-          <w:color w:val="000000"/>
-          <w:sz w:val="24"/>
-        </w:rPr>
-        <w:t>) terhadap niat bermain (</w:t>
-      </w:r>
-      <w:r>
-        <w:rPr>
-          <w:rFonts w:ascii="Times New Roman" w:hAnsi="Times New Roman" w:cs="Times New Roman" w:eastAsia="Times New Roman"/>
-          <w:b w:val="0"/>
-          <w:i/>
-          <w:color w:val="000000"/>
-          <w:sz w:val="24"/>
-        </w:rPr>
-        <w:t>intention to play</w:t>
-      </w:r>
-      <w:r>
-        <w:rPr>
-          <w:rFonts w:ascii="Times New Roman" w:hAnsi="Times New Roman" w:cs="Times New Roman" w:eastAsia="Times New Roman"/>
-          <w:b w:val="0"/>
-          <w:i w:val="0"/>
-          <w:color w:val="000000"/>
-          <w:sz w:val="24"/>
-        </w:rPr>
-        <w:t>) Mobile Legends pada Generasi Z di Indonesia.</w:t>
-      </w:r>
-    </w:p>
-    <w:p>
-      <w:pPr>
-        <w:spacing w:line="360" w:lineRule="auto" w:before="0" w:after="0"/>
-        <w:ind w:left="709" w:hanging="227"/>
-        <w:jc w:val="both"/>
-      </w:pPr>
-      <w:r>
-        <w:rPr>
-          <w:rFonts w:ascii="Times New Roman" w:hAnsi="Times New Roman" w:cs="Times New Roman" w:eastAsia="Times New Roman"/>
-          <w:b w:val="0"/>
-          <w:i w:val="0"/>
-          <w:color w:val="000000"/>
-          <w:sz w:val="24"/>
-        </w:rPr>
-        <w:t>4. Untuk menguji pengaruh simultan pemasaran influencer (</w:t>
-      </w:r>
-      <w:r>
-        <w:rPr>
-          <w:rFonts w:ascii="Times New Roman" w:hAnsi="Times New Roman" w:cs="Times New Roman" w:eastAsia="Times New Roman"/>
-          <w:b w:val="0"/>
-          <w:i/>
-          <w:color w:val="000000"/>
-          <w:sz w:val="24"/>
-        </w:rPr>
-        <w:t>influencer marketing</w:t>
-      </w:r>
-      <w:r>
-        <w:rPr>
-          <w:rFonts w:ascii="Times New Roman" w:hAnsi="Times New Roman" w:cs="Times New Roman" w:eastAsia="Times New Roman"/>
-          <w:b w:val="0"/>
-          <w:i w:val="0"/>
-          <w:color w:val="000000"/>
-          <w:sz w:val="24"/>
-        </w:rPr>
-        <w:t>), komunikasi elektronik dari mulut ke mulut (</w:t>
-      </w:r>
-      <w:r>
-        <w:rPr>
-          <w:rFonts w:ascii="Times New Roman" w:hAnsi="Times New Roman" w:cs="Times New Roman" w:eastAsia="Times New Roman"/>
-          <w:b w:val="0"/>
-          <w:i/>
-          <w:color w:val="000000"/>
-          <w:sz w:val="24"/>
-        </w:rPr>
-        <w:t>electronic word-of-mouth</w:t>
-      </w:r>
-      <w:r>
-        <w:rPr>
-          <w:rFonts w:ascii="Times New Roman" w:hAnsi="Times New Roman" w:cs="Times New Roman" w:eastAsia="Times New Roman"/>
-          <w:b w:val="0"/>
-          <w:i w:val="0"/>
-          <w:color w:val="000000"/>
-          <w:sz w:val="24"/>
-        </w:rPr>
-        <w:t>), dan persepsi kenikmatan (</w:t>
       </w:r>
       <w:r>
         <w:rPr>
@@ -3114,7 +3067,7 @@
           <w:color w:val="000000"/>
           <w:sz w:val="24"/>
         </w:rPr>
-        <w:t>): SPSS regresi berganda (Y = b0 + b1X1 + b2X2 + b3X3 + e) vs SmartPLS-SEM (laten reflektif) — PROPOSED, menunggu arahan pembimbing + lisensi. Estimand (koefisien parsial + R² simultan) mengikuti opsi terpilih.</w:t>
+        <w:t>): SPSS regresi berganda (Y = b0 + b1X1 + b2X2 + b3X3 + e) vs SmartPLS-SEM (laten reflektif) — PROPOSED, menunggu arahan pembimbing dan lisensi. Estimand (koefisien regresi parsial dan R²) mengikuti opsi terpilih.</w:t>
       </w:r>
     </w:p>
     <w:p>
@@ -3132,7 +3085,7 @@
           <w:color w:val="000000"/>
           <w:sz w:val="24"/>
         </w:rPr>
-        <w:t>P06 Definisi Generasi Z + kriteria inklusi + target N: kandidat lahir 1997–2012 dari APJII via detikInet (sekunder) dan cuplikan BPS daerah — [MENUNGGU VERIFIKASI PDF primer APJII + publikasi/tabel BPS SUPAS 2025]. Status bermain (pernah/aktif), teknik sampling, dan dasar power: OPEN, dilarang mengarang N.</w:t>
+        <w:t>P06 Definisi Generasi Z, kriteria inklusi, dan target N: kandidat lahir 1997–2012 dari APJII via detikInet (sekunder) dan cuplikan BPS daerah — [MENUNGGU VERIFIKASI PDF primer APJII dan publikasi/tabel BPS SUPAS 2025]. Status bermain (pernah/aktif), teknik sampling, dan dasar power: OPEN, dilarang mengarang N.</w:t>
       </w:r>
     </w:p>
     <w:p>
@@ -3150,7 +3103,7 @@
           <w:color w:val="000000"/>
           <w:sz w:val="24"/>
         </w:rPr>
-        <w:t>E01 Fenomena inti: tetap inference (proposed) berbasis triangulasi; belum ada fakta "X% Gen Z main MLBB". Butuh fetch penuh: PDF APJII 2025/2026 via survei.apjii.or.id/survei, PDF + direktori SUPAS 2025, siaran pers BPS Mei 2026, laporan penuh Sensor Tower, halaman primer Esports Charts S15/S16/S17.</w:t>
+        <w:t>E01 Fenomena inti: tetap inference (proposed) berbasis triangulasi; belum ada fakta "X% Gen Z main MLBB". Butuh fetch penuh: PDF APJII 2025/2026 via survei.apjii.or.id/survei, PDF dan direktori SUPAS 2025, siaran pers BPS Mei 2026, laporan penuh Sensor Tower, halaman primer Esports Charts S15/S16/S17.</w:t>
       </w:r>
     </w:p>
     <w:p>
@@ -4882,7 +4835,7 @@
                 <w:color w:val="000000"/>
                 <w:sz w:val="20"/>
               </w:rPr>
-              <w:t>Kredibilitas + infotainment → nilai iklan → intensi</w:t>
+              <w:t>Kredibilitas dan infotainment → nilai iklan → intensi</w:t>
             </w:r>
           </w:p>
         </w:tc>
@@ -5058,7 +5011,7 @@
                 <w:color w:val="000000"/>
                 <w:sz w:val="20"/>
               </w:rPr>
-              <w:t>A + mekanisme</w:t>
+              <w:t>A, dengan mekanisme</w:t>
             </w:r>
           </w:p>
         </w:tc>
@@ -5126,7 +5079,7 @@
                 <w:color w:val="000000"/>
                 <w:sz w:val="20"/>
               </w:rPr>
-              <w:t>Nilai informasi + hiburan + kepercayaan → utilitas → predisposisi → intensi</w:t>
+              <w:t>Nilai informasi, hiburan, dan kepercayaan → utilitas → predisposisi → intensi</w:t>
             </w:r>
           </w:p>
         </w:tc>
@@ -5522,7 +5475,7 @@
                 <w:color w:val="000000"/>
                 <w:sz w:val="20"/>
               </w:rPr>
-              <w:t xml:space="preserve">Kualitas + kredibilitas </w:t>
+              <w:t xml:space="preserve">Kualitas dan kredibilitas </w:t>
             </w:r>
             <w:r>
               <w:rPr>
@@ -5542,7 +5495,7 @@
                 <w:color w:val="000000"/>
                 <w:sz w:val="20"/>
               </w:rPr>
-              <w:t xml:space="preserve"> → kemudahan + kebermanfaatan → adopsi → intensi</w:t>
+              <w:t xml:space="preserve"> → kemudahan dan kebermanfaatan → adopsi → intensi</w:t>
             </w:r>
           </w:p>
         </w:tc>
@@ -5586,7 +5539,7 @@
                 <w:color w:val="000000"/>
                 <w:sz w:val="20"/>
               </w:rPr>
-              <w:t>A IAM+TAM</w:t>
+              <w:t>A IAM dan TAM</w:t>
             </w:r>
           </w:p>
         </w:tc>
@@ -5674,7 +5627,7 @@
                 <w:color w:val="000000"/>
                 <w:sz w:val="20"/>
               </w:rPr>
-              <w:t>Kualitas + kredibilitas + kesesuaian tugas + sikap → kebermanfaatan → adopsi → intensi; kebutuhan informasi tidak signifikan</w:t>
+              <w:t>Kualitas, kredibilitas, kesesuaian tugas, dan sikap → kebermanfaatan → adopsi → intensi; kebutuhan informasi tidak signifikan</w:t>
             </w:r>
           </w:p>
         </w:tc>
@@ -5806,7 +5759,7 @@
                 <w:color w:val="000000"/>
                 <w:sz w:val="20"/>
               </w:rPr>
-              <w:t>Kualitas + kuantitas + kebutuhan + sikap → kebermanfaatan/adopsi → intensi; kredibilitas tidak signifikan</w:t>
+              <w:t>Kualitas, kuantitas, kebutuhan, dan sikap → kebermanfaatan/adopsi → intensi; kredibilitas tidak signifikan</w:t>
             </w:r>
           </w:p>
         </w:tc>
@@ -6244,7 +6197,7 @@
                 <w:color w:val="000000"/>
                 <w:sz w:val="20"/>
               </w:rPr>
-              <w:t xml:space="preserve">Kenikmatan tidak signifikan ke kebermanfaatan/sikap; kebermanfaatan + sikap + </w:t>
+              <w:t xml:space="preserve">Kenikmatan tidak signifikan ke kebermanfaatan/sikap; kebermanfaatan, sikap, dan </w:t>
             </w:r>
             <w:r>
               <w:rPr>
@@ -6428,7 +6381,7 @@
                 <w:color w:val="000000"/>
                 <w:sz w:val="20"/>
               </w:rPr>
-              <w:t>A X3 + kontra pembanding</w:t>
+              <w:t>A X3, dengan kontra pembanding</w:t>
             </w:r>
           </w:p>
         </w:tc>
@@ -6608,7 +6561,7 @@
                 <w:color w:val="000000"/>
                 <w:sz w:val="20"/>
               </w:rPr>
-              <w:t xml:space="preserve">Kemudahan + kebermanfaatan + sikap + kenikmatan → </w:t>
+              <w:t xml:space="preserve">Kemudahan, kebermanfaatan, sikap, dan kenikmatan → </w:t>
             </w:r>
             <w:r>
               <w:rPr>
@@ -6794,7 +6747,7 @@
                 <w:color w:val="000000"/>
                 <w:sz w:val="20"/>
               </w:rPr>
-              <w:t>A + nuansa kontra anteseden</w:t>
+              <w:t>A, dengan nuansa kontra anteseden</w:t>
             </w:r>
           </w:p>
         </w:tc>
@@ -6872,7 +6825,7 @@
                 <w:color w:val="000000"/>
                 <w:sz w:val="20"/>
               </w:rPr>
-              <w:t xml:space="preserve"> → intensi langsung dan via sikap merek + citra</w:t>
+              <w:t xml:space="preserve"> → intensi langsung dan via sikap merek dan citra</w:t>
             </w:r>
           </w:p>
         </w:tc>
@@ -7227,7 +7180,7 @@
           <w:color w:val="000000"/>
           <w:sz w:val="24"/>
         </w:rPr>
-        <w:t xml:space="preserve"> (2024) pada investor muda Indonesia (N=344): kecanggihan investor dan </w:t>
+        <w:t xml:space="preserve"> (2024) terhadap 344 investor muda di Indonesia: kecanggihan investor dan </w:t>
       </w:r>
       <w:r>
         <w:rPr>
@@ -7918,54 +7871,7 @@
           <w:color w:val="000000"/>
           <w:sz w:val="24"/>
         </w:rPr>
-        <w:t>H4 — Pengaruh simultan. Ketiga pendorong diuji bersama pada satu Y yang sama karena pola lintas jalur menunjukkan ketiganya saling melengkapi: persuasif (X1), informasional (X2), dan hedonik (X3). Bukti simultan pada gim lokal (S12) serta rantai anteseden kenikmatan (S13, S15) memberi dasar bahwa model gabungan lebih informatif daripada tiga regresi terpisah. Pernyataan uji:</w:t>
-      </w:r>
-    </w:p>
-    <w:p>
-      <w:pPr>
-        <w:spacing w:line="360" w:lineRule="auto" w:before="0" w:after="0"/>
-        <w:ind w:firstLine="709"/>
-        <w:jc w:val="both"/>
-      </w:pPr>
-      <w:r>
-        <w:rPr>
-          <w:rFonts w:ascii="Times New Roman" w:hAnsi="Times New Roman" w:cs="Times New Roman" w:eastAsia="Times New Roman"/>
-          <w:b/>
-          <w:i w:val="0"/>
-          <w:color w:val="000000"/>
-          <w:sz w:val="24"/>
-        </w:rPr>
-        <w:t>H4:</w:t>
-      </w:r>
-      <w:r>
-        <w:rPr>
-          <w:rFonts w:ascii="Times New Roman" w:hAnsi="Times New Roman" w:cs="Times New Roman" w:eastAsia="Times New Roman"/>
-          <w:b w:val="0"/>
-          <w:i w:val="0"/>
-          <w:color w:val="000000"/>
-          <w:sz w:val="24"/>
-        </w:rPr>
-        <w:t xml:space="preserve"> Variabel X1, X2, dan X3 secara simultan berpengaruh positif terhadap variabel Y (</w:t>
-      </w:r>
-      <w:r>
-        <w:rPr>
-          <w:rFonts w:ascii="Times New Roman" w:hAnsi="Times New Roman" w:cs="Times New Roman" w:eastAsia="Times New Roman"/>
-          <w:b w:val="0"/>
-          <w:i/>
-          <w:color w:val="000000"/>
-          <w:sz w:val="24"/>
-        </w:rPr>
-        <w:t>intention to play</w:t>
-      </w:r>
-      <w:r>
-        <w:rPr>
-          <w:rFonts w:ascii="Times New Roman" w:hAnsi="Times New Roman" w:cs="Times New Roman" w:eastAsia="Times New Roman"/>
-          <w:b w:val="0"/>
-          <w:i w:val="0"/>
-          <w:color w:val="000000"/>
-          <w:sz w:val="24"/>
-        </w:rPr>
-        <w:t xml:space="preserve"> Mobile Legends).</w:t>
+        <w:t>Seluruh hipotesis berstatus proposisi uji arah positif (H1: b1 &gt; 0, H2: b2 &gt; 0, H3: b3 &gt; 0). Pembuktian menunggu Bab III–IV (uji validitas, reliabilitas, asumsi klasik, dan uji hipotesis dengan perangkat lunak bernama).</w:t>
       </w:r>
     </w:p>
     <w:p>
@@ -7983,7 +7889,31 @@
           <w:color w:val="000000"/>
           <w:sz w:val="24"/>
         </w:rPr>
-        <w:t>Seluruh hipotesis berstatus proposisi uji dua sisi arah positif (b1&gt;0, b2&gt;0, b3&gt;0; simultan signifikan). Pembuktian menunggu Bab III–IV (uji validitas, reliabilitas, asumsi klasik, dan uji hipotesis dengan perangkat lunak bernama).</w:t>
+        <w:t>Status verifikasi 2.3: format H1–H3 mengikuti template wajib H: X berpengaruh positif terhadap Y. Uraian studi relevan mendahului setiap pernyataan. Tidak ada klaim signifikansi, besaran pengaruh, maupun mediasi yang diuji pada studi ini. S10 disitir dengan label DOI UNVERIFIED.</w:t>
+      </w:r>
+    </w:p>
+    <w:p>
+      <w:pPr>
+        <w:pStyle w:val="Heading2"/>
+        <w:jc w:val="left"/>
+      </w:pPr>
+      <w:r>
+        <w:rPr>
+          <w:rFonts w:ascii="Times New Roman" w:hAnsi="Times New Roman" w:cs="Times New Roman" w:eastAsia="Times New Roman"/>
+          <w:b/>
+          <w:color w:val="000000"/>
+          <w:sz w:val="24"/>
+        </w:rPr>
+      </w:r>
+      <w:r>
+        <w:rPr>
+          <w:rFonts w:ascii="Times New Roman" w:hAnsi="Times New Roman" w:cs="Times New Roman" w:eastAsia="Times New Roman"/>
+          <w:b/>
+          <w:i w:val="0"/>
+          <w:color w:val="000000"/>
+          <w:sz w:val="24"/>
+        </w:rPr>
+        <w:t>2.4 Rerangka Penelitian</w:t>
       </w:r>
     </w:p>
     <w:p>
@@ -8001,48 +7931,6 @@
           <w:color w:val="000000"/>
           <w:sz w:val="24"/>
         </w:rPr>
-        <w:t>Status verifikasi 2.3: format H1–H4 mengikuti template wajib H: X berpengaruh positif terhadap Y. Uraian studi relevan mendahului setiap pernyataan. Tidak ada klaim signifikansi, besaran pengaruh, maupun mediasi yang diuji pada studi ini. S10 disitir dengan label DOI UNVERIFIED.</w:t>
-      </w:r>
-    </w:p>
-    <w:p>
-      <w:pPr>
-        <w:pStyle w:val="Heading2"/>
-        <w:jc w:val="left"/>
-      </w:pPr>
-      <w:r>
-        <w:rPr>
-          <w:rFonts w:ascii="Times New Roman" w:hAnsi="Times New Roman" w:cs="Times New Roman" w:eastAsia="Times New Roman"/>
-          <w:b/>
-          <w:color w:val="000000"/>
-          <w:sz w:val="24"/>
-        </w:rPr>
-      </w:r>
-      <w:r>
-        <w:rPr>
-          <w:rFonts w:ascii="Times New Roman" w:hAnsi="Times New Roman" w:cs="Times New Roman" w:eastAsia="Times New Roman"/>
-          <w:b/>
-          <w:i w:val="0"/>
-          <w:color w:val="000000"/>
-          <w:sz w:val="24"/>
-        </w:rPr>
-        <w:t>2.4 Rerangka Penelitian</w:t>
-      </w:r>
-    </w:p>
-    <w:p>
-      <w:pPr>
-        <w:widowControl/>
-        <w:spacing w:line="360" w:lineRule="auto" w:before="0" w:after="0"/>
-        <w:ind w:firstLine="709"/>
-        <w:jc w:val="both"/>
-      </w:pPr>
-      <w:r>
-        <w:rPr>
-          <w:rFonts w:ascii="Times New Roman" w:hAnsi="Times New Roman" w:cs="Times New Roman" w:eastAsia="Times New Roman"/>
-          <w:b w:val="0"/>
-          <w:i w:val="0"/>
-          <w:color w:val="000000"/>
-          <w:sz w:val="24"/>
-        </w:rPr>
         <w:t>Rerangka berupa bagan hubungan antarvariabel termasuk hipotesisnya, tanpa mediator maupun moderator (model pengaruh langsung).</w:t>
       </w:r>
     </w:p>
@@ -8056,7 +7944,7 @@
         <w:drawing>
           <wp:inline xmlns:a="http://schemas.openxmlformats.org/drawingml/2006/main" xmlns:pic="http://schemas.openxmlformats.org/drawingml/2006/picture">
             <wp:extent cx="5040000" cy="2246138"/>
-            <wp:docPr id="1" name="Picture 1"/>
+            <wp:docPr id="2" name="Picture 2"/>
             <wp:cNvGraphicFramePr>
               <a:graphicFrameLocks noChangeAspect="1"/>
             </wp:cNvGraphicFramePr>
@@ -8068,7 +7956,7 @@
                     <pic:cNvPicPr/>
                   </pic:nvPicPr>
                   <pic:blipFill>
-                    <a:blip r:embed="rId15"/>
+                    <a:blip r:embed="rId16"/>
                     <a:stretch>
                       <a:fillRect/>
                     </a:stretch>
@@ -8154,7 +8042,7 @@
           <w:color w:val="000000"/>
           <w:sz w:val="24"/>
         </w:rPr>
-        <w:t xml:space="preserve"> dipersepsi ahli, jujur, dan menarik); X2 memotret sisi informasional (apakah ulasan komunitas dibaca, dinilai berkualitas, dan diadopsi); X3 memotret sisi hedonik (apakah bermain itu sendiri menyenangkan). Ketiganya diduga menggerakkan Y, yaitu niat memainkan kembali Mobile Legends dalam horizon waktu yang sama pada seluruh butir (prinsip TACT). H1–H3 menguji pengaruh parsial masing-masing X terhadap Y; H4 menguji pengaruh simultan ketiganya terhadap Y. Mediasi melalui sikap, nilai iklan, kebermanfaatan, adopsi, atau kepercayaan dicatat sebagai agenda pengembangan (merujuk S05, S01, S06–S08, S17), bukan sebagai jalur yang diuji pada model usulan.</w:t>
+        <w:t xml:space="preserve"> dipersepsi ahli, jujur, dan menarik); X2 memotret sisi informasional (apakah ulasan komunitas dibaca, dinilai berkualitas, dan diadopsi); X3 memotret sisi hedonik (apakah bermain itu sendiri menyenangkan). Ketiganya diduga menggerakkan Y, yaitu niat memainkan kembali Mobile Legends dalam horizon waktu yang sama pada seluruh butir (prinsip TACT). H1–H3 menguji pengaruh masing-masing variabel independen (X1, X2, X3) secara langsung terhadap variabel dependen (Y). Mediasi melalui sikap, nilai iklan, kebermanfaatan, adopsi, atau kepercayaan dicatat sebagai agenda pengembangan (merujuk S05, S01, S06–S08, S17), bukan sebagai jalur yang diuji pada model usulan.</w:t>
       </w:r>
     </w:p>
     <w:p>
@@ -8172,7 +8060,7 @@
           <w:color w:val="000000"/>
           <w:sz w:val="24"/>
         </w:rPr>
-        <w:t>Status verifikasi 2.4: bagan berstatus PROPOSED direct-effect dan konsisten dengan H1–H4 serta persamaan Bab III (Opsi A regresi atau Opsi B SEM, menunggu kunci pembimbing). Tidak ada variabel, panah, maupun interaksi tambahan yang diklaim.</w:t>
+        <w:t>Status verifikasi 2.4: bagan berstatus PROPOSED direct-effect dan konsisten dengan H1–H3 serta persamaan Bab III (Opsi A regresi atau Opsi B SEM, menunggu kunci pembimbing). Tidak ada variabel, panah, maupun interaksi tambahan yang diklaim.</w:t>
       </w:r>
     </w:p>
     <w:p>
@@ -8310,7 +8198,7 @@
           <w:color w:val="000000"/>
           <w:sz w:val="24"/>
         </w:rPr>
-        <w:t xml:space="preserve">Teori inti: Ohanian (1990); Ajzen (1991) + panduan TPB UMass; Venkatesh (2000); Venkatesh dan Bala (2008); Venkatesh </w:t>
+        <w:t xml:space="preserve">Teori inti: Ohanian (1990); Ajzen (1991) dan panduan TPB UMass; Venkatesh (2000); Venkatesh dan Bala (2008); Venkatesh </w:t>
       </w:r>
       <w:r>
         <w:rPr>
@@ -8606,7 +8494,7 @@
           <w:color w:val="000000"/>
           <w:sz w:val="24"/>
         </w:rPr>
-        <w:t xml:space="preserve"> (2024) [S-FEB, relevansi terbatas, tematik generasi muda + pengaruh sosial].</w:t>
+        <w:t xml:space="preserve"> (2024) [S-FEB, relevansi terbatas, tematik generasi muda dan pengaruh sosial].</w:t>
       </w:r>
     </w:p>
     <w:p>
@@ -9357,7 +9245,7 @@
           <w:color w:val="000000"/>
           <w:sz w:val="24"/>
         </w:rPr>
-        <w:t>Keterangan: Y = Intention to Play Mobile Legends; X1 = Influencer Marketing; X2 = Electronic Word-of-Mouth; X3 = Perceived Enjoyment; b0 = konstanta; b1, b2, b3 = koefisien regresi parsial; e = galat. Hipotesis yang diuji: H1: b1 &gt; 0; H2: b2 &gt; 0; H3: b3 &gt; 0; H4 (simultan): R kuadrat signifikan. Arah positif merupakan proposisi yang diuji, bukan temuan.</w:t>
+        <w:t>Keterangan: Y = Intention to Play Mobile Legends; X1 = Influencer Marketing; X2 = Electronic Word-of-Mouth; X3 = Perceived Enjoyment; b0 = konstanta; b1, b2, b3 = koefisien regresi parsial; e = galat. Hipotesis yang diuji: H1: b1 &gt; 0; H2: b2 &gt; 0; H3: b3 &gt; 0. Arah positif merupakan proposisi yang diuji, bukan temuan.</w:t>
       </w:r>
     </w:p>
     <w:p>
@@ -9430,7 +9318,7 @@
           <w:color w:val="000000"/>
           <w:sz w:val="24"/>
         </w:rPr>
-        <w:t>Keterangan: p1, p2, p3 = koefisien jalur (path coefficient); indikator tiap konstruk laten bersifat reflektif dan ditetapkan pada Subbab 3.4. Hipotesis H1–H4 analog dalam koefisien jalur; evaluasi R kuadrat, Q kuadrat, dan f kuadrat menyusul kunci P04.</w:t>
+        <w:t>Keterangan: p1, p2, p3 = koefisien jalur (path coefficient); indikator tiap konstruk laten bersifat reflektif dan ditetapkan pada Subbab 3.4. Hipotesis H1–H3 analog dalam koefisien jalur; evaluasi R kuadrat, Q kuadrat, dan f kuadrat menyusul kunci P04.</w:t>
       </w:r>
     </w:p>
     <w:p>
@@ -10986,7 +10874,7 @@
           <w:color w:val="000000"/>
           <w:sz w:val="24"/>
         </w:rPr>
-        <w:t>3. Analisis regresi linear berganda sesuai persamaan (3.1), pelaporan koefisien, R kuadrat, uji simultan (F) dan uji parsial (t).</w:t>
+        <w:t>3. Analisis regresi linear berganda sesuai persamaan (3.1), pelaporan koefisien regresi parsial, koefisien determinasi (R kuadrat), dan pengujian signifikansi parsial (uji t).</w:t>
       </w:r>
     </w:p>
     <w:p>
@@ -11003,7 +10891,7 @@
           <w:color w:val="000000"/>
           <w:sz w:val="24"/>
         </w:rPr>
-        <w:t>4. Pengujian hipotesis. Kaidah simpulan: H1 diterima bila koefisien bertanda positif dan nilai-p di bawah taraf signifikansi; bila tidak memenuhi, hipotesis dinyatakan tidak berpengaruh. Taraf signifikansi: OPEN (ditetapkan konvensional 5% setelah kunci pembimbing).</w:t>
+        <w:t>4. Pengujian hipotesis. Kaidah simpulan: hipotesis diterima bila koefisien bertanda positif dan nilai-p di bawah taraf signifikansi; bila tidak memenuhi, hipotesis dinyatakan tidak berpengaruh. Taraf signifikansi: OPEN (ditetapkan konvensional 5% setelah kunci pembimbing).</w:t>
       </w:r>
     </w:p>
     <w:p>
@@ -11158,7 +11046,7 @@
           <w:color w:val="000000"/>
           <w:sz w:val="24"/>
         </w:rPr>
-        <w:t>3. Pengujian hipotesis H1–H4 analog dalam koefisien jalur dengan kaidah tanda dan nilai-p yang sama.</w:t>
+        <w:t>3. Pengujian hipotesis H1–H3 analog dalam koefisien jalur dengan kaidah tanda dan nilai-p yang sama.</w:t>
       </w:r>
     </w:p>
     <w:p>
@@ -11234,7 +11122,7 @@
           <w:color w:val="000000"/>
           <w:sz w:val="24"/>
         </w:rPr>
-        <w:t>2. Rentang tahun lahir Generasi Z + kriteria inklusi rinci + horizon waktu Y (mis. 3 bulan) — kunci P06 (Subbab 3.2a, 3.4).</w:t>
+        <w:t>2. Rentang tahun lahir Generasi Z, kriteria inklusi rinci, dan horizon waktu Y (mis. 3 bulan) — kunci P06 (Subbab 3.2a, 3.4).</w:t>
       </w:r>
     </w:p>
     <w:p>
@@ -11251,7 +11139,7 @@
           <w:color w:val="000000"/>
           <w:sz w:val="24"/>
         </w:rPr>
-        <w:t>3. Teknik sampling final + prosedur sebar + periode survei + pertanyaan saring — persetujuan pembimbing atas usulan purposive (Subbab 3.2b).</w:t>
+        <w:t>3. Teknik sampling final, prosedur sebar, periode survei, dan pertanyaan saring — persetujuan pembimbing atas usulan purposive (Subbab 3.2b).</w:t>
       </w:r>
     </w:p>
     <w:p>
@@ -11268,7 +11156,7 @@
           <w:color w:val="000000"/>
           <w:sz w:val="24"/>
         </w:rPr>
-        <w:t>4. N final + kaidah yang dipakai (satu dari tiga opsi) + taraf signifikansi — kunci P04/P06 (Subbab 3.2c, 3.5).</w:t>
+        <w:t>4. N final, kaidah yang dipakai (satu dari tiga opsi), dan taraf signifikansi — kunci P04/P06 (Subbab 3.2c, 3.5).</w:t>
       </w:r>
     </w:p>
     <w:p>
@@ -11507,9 +11395,9 @@
           <w:color w:val="000000"/>
           <w:sz w:val="24"/>
         </w:rPr>
-        <w:t xml:space="preserve">, 13+, versi 2.2.16.1232.1]. Retrieved October 1, 2026, from </w:t>
-      </w:r>
-      <w:hyperlink r:id="rId16">
+        <w:t xml:space="preserve">, 13 tahun ke atas, versi 2.2.16.1232.1]. Retrieved October 1, 2026, from </w:t>
+      </w:r>
+      <w:hyperlink r:id="rId17">
         <w:r>
           <w:rPr>
             <w:rFonts w:ascii="Times New Roman" w:hAnsi="Times New Roman" w:cs="Times New Roman" w:eastAsia="Times New Roman"/>
@@ -11557,7 +11445,7 @@
         </w:rPr>
         <w:t xml:space="preserve"> [portal]. Retrieved October 1, 2026, from </w:t>
       </w:r>
-      <w:hyperlink r:id="rId17">
+      <w:hyperlink r:id="rId18">
         <w:r>
           <w:rPr>
             <w:rFonts w:ascii="Times New Roman" w:hAnsi="Times New Roman" w:cs="Times New Roman" w:eastAsia="Times New Roman"/>
@@ -11625,7 +11513,7 @@
         </w:rPr>
         <w:t xml:space="preserve">: No. Katalog 2201007, No. Publikasi 04100.25001, 13,59 MB]. Retrieved October 1, 2026, from </w:t>
       </w:r>
-      <w:hyperlink r:id="rId18">
+      <w:hyperlink r:id="rId19">
         <w:r>
           <w:rPr>
             <w:rFonts w:ascii="Times New Roman" w:hAnsi="Times New Roman" w:cs="Times New Roman" w:eastAsia="Times New Roman"/>
@@ -11693,7 +11581,7 @@
         </w:rPr>
         <w:t xml:space="preserve">: No. Katalog 2101048, No. Publikasi 04100.26029, 26,21 MB]. Retrieved October 1, 2026, from </w:t>
       </w:r>
-      <w:hyperlink r:id="rId19">
+      <w:hyperlink r:id="rId20">
         <w:r>
           <w:rPr>
             <w:rFonts w:ascii="Times New Roman" w:hAnsi="Times New Roman" w:cs="Times New Roman" w:eastAsia="Times New Roman"/>
@@ -11768,7 +11656,7 @@
         </w:rPr>
         <w:t xml:space="preserve">(4), 81–94. </w:t>
       </w:r>
-      <w:hyperlink r:id="rId20">
+      <w:hyperlink r:id="rId21">
         <w:r>
           <w:rPr>
             <w:rFonts w:ascii="Times New Roman" w:hAnsi="Times New Roman" w:cs="Times New Roman" w:eastAsia="Times New Roman"/>
@@ -11976,7 +11864,7 @@
         </w:rPr>
         <w:t xml:space="preserve">(2), 27–40. </w:t>
       </w:r>
-      <w:hyperlink r:id="rId21">
+      <w:hyperlink r:id="rId22">
         <w:r>
           <w:rPr>
             <w:rFonts w:ascii="Times New Roman" w:hAnsi="Times New Roman" w:cs="Times New Roman" w:eastAsia="Times New Roman"/>
@@ -12024,7 +11912,7 @@
         </w:rPr>
         <w:t xml:space="preserve"> [pelapor SEKUNDER APJII Survei Profil Internet Indonesia 2026, rilis 19 Mei 2026]. Retrieved October 1, 2026, from </w:t>
       </w:r>
-      <w:hyperlink r:id="rId22">
+      <w:hyperlink r:id="rId23">
         <w:r>
           <w:rPr>
             <w:rFonts w:ascii="Times New Roman" w:hAnsi="Times New Roman" w:cs="Times New Roman" w:eastAsia="Times New Roman"/>
@@ -12072,7 +11960,7 @@
         </w:rPr>
         <w:t xml:space="preserve">(4), 239–253. </w:t>
       </w:r>
-      <w:hyperlink r:id="rId23">
+      <w:hyperlink r:id="rId24">
         <w:r>
           <w:rPr>
             <w:rFonts w:ascii="Times New Roman" w:hAnsi="Times New Roman" w:cs="Times New Roman" w:eastAsia="Times New Roman"/>
@@ -12120,7 +12008,7 @@
         </w:rPr>
         <w:t xml:space="preserve"> Retrieved October 1, 2026, from </w:t>
       </w:r>
-      <w:hyperlink r:id="rId24">
+      <w:hyperlink r:id="rId25">
         <w:r>
           <w:rPr>
             <w:rFonts w:ascii="Times New Roman" w:hAnsi="Times New Roman" w:cs="Times New Roman" w:eastAsia="Times New Roman"/>
@@ -12205,7 +12093,7 @@
         </w:rPr>
         <w:t xml:space="preserve"> [pelapor SEKUNDER APJII Survei Profil Internet Indonesia 2025]. Retrieved October 1, 2026, from </w:t>
       </w:r>
-      <w:hyperlink r:id="rId25">
+      <w:hyperlink r:id="rId26">
         <w:r>
           <w:rPr>
             <w:rFonts w:ascii="Times New Roman" w:hAnsi="Times New Roman" w:cs="Times New Roman" w:eastAsia="Times New Roman"/>
@@ -12253,7 +12141,7 @@
         </w:rPr>
         <w:t xml:space="preserve">(4), 204–217. </w:t>
       </w:r>
-      <w:hyperlink r:id="rId26">
+      <w:hyperlink r:id="rId27">
         <w:r>
           <w:rPr>
             <w:rFonts w:ascii="Times New Roman" w:hAnsi="Times New Roman" w:cs="Times New Roman" w:eastAsia="Times New Roman"/>
@@ -12301,7 +12189,7 @@
         </w:rPr>
         <w:t xml:space="preserve"> (pp. 410–415). Atlantis Press. </w:t>
       </w:r>
-      <w:hyperlink r:id="rId27">
+      <w:hyperlink r:id="rId28">
         <w:r>
           <w:rPr>
             <w:rFonts w:ascii="Times New Roman" w:hAnsi="Times New Roman" w:cs="Times New Roman" w:eastAsia="Times New Roman"/>
@@ -12421,7 +12309,7 @@
           <w:color w:val="000000"/>
           <w:sz w:val="24"/>
         </w:rPr>
-        <w:t xml:space="preserve"> [listing, region gl=UK: 500M+ </w:t>
+        <w:t xml:space="preserve"> [listing, region gl=UK: 500 juta unduhan ke atas (</w:t>
       </w:r>
       <w:r>
         <w:rPr>
@@ -12431,26 +12319,6 @@
           <w:color w:val="000000"/>
           <w:sz w:val="24"/>
         </w:rPr>
-        <w:t>downloads</w:t>
-      </w:r>
-      <w:r>
-        <w:rPr>
-          <w:rFonts w:ascii="Times New Roman" w:hAnsi="Times New Roman" w:cs="Times New Roman" w:eastAsia="Times New Roman"/>
-          <w:b w:val="0"/>
-          <w:i w:val="0"/>
-          <w:color w:val="000000"/>
-          <w:sz w:val="24"/>
-        </w:rPr>
-        <w:t xml:space="preserve"> (</w:t>
-      </w:r>
-      <w:r>
-        <w:rPr>
-          <w:rFonts w:ascii="Times New Roman" w:hAnsi="Times New Roman" w:cs="Times New Roman" w:eastAsia="Times New Roman"/>
-          <w:b w:val="0"/>
-          <w:i/>
-          <w:color w:val="000000"/>
-          <w:sz w:val="24"/>
-        </w:rPr>
         <w:t>bucket</w:t>
       </w:r>
       <w:r>
@@ -12463,7 +12331,7 @@
         </w:rPr>
         <w:t xml:space="preserve">), 3,9 star, PEGI 12, update 22 Sep 2026]. Retrieved October 1, 2026, from </w:t>
       </w:r>
-      <w:hyperlink r:id="rId28">
+      <w:hyperlink r:id="rId29">
         <w:r>
           <w:rPr>
             <w:rFonts w:ascii="Times New Roman" w:hAnsi="Times New Roman" w:cs="Times New Roman" w:eastAsia="Times New Roman"/>
@@ -12511,7 +12379,7 @@
         </w:rPr>
         <w:t xml:space="preserve">(1), 15–22. </w:t>
       </w:r>
-      <w:hyperlink r:id="rId29">
+      <w:hyperlink r:id="rId30">
         <w:r>
           <w:rPr>
             <w:rFonts w:ascii="Times New Roman" w:hAnsi="Times New Roman" w:cs="Times New Roman" w:eastAsia="Times New Roman"/>
@@ -12596,7 +12464,7 @@
         </w:rPr>
         <w:t xml:space="preserve">(10), 478. </w:t>
       </w:r>
-      <w:hyperlink r:id="rId30">
+      <w:hyperlink r:id="rId31">
         <w:r>
           <w:rPr>
             <w:rFonts w:ascii="Times New Roman" w:hAnsi="Times New Roman" w:cs="Times New Roman" w:eastAsia="Times New Roman"/>
@@ -12684,7 +12552,7 @@
         </w:rPr>
         <w:t xml:space="preserve">(1), 497–506. </w:t>
       </w:r>
-      <w:hyperlink r:id="rId31">
+      <w:hyperlink r:id="rId32">
         <w:r>
           <w:rPr>
             <w:rFonts w:ascii="Times New Roman" w:hAnsi="Times New Roman" w:cs="Times New Roman" w:eastAsia="Times New Roman"/>
@@ -12732,7 +12600,7 @@
         </w:rPr>
         <w:t xml:space="preserve">(2), 145–157. </w:t>
       </w:r>
-      <w:hyperlink r:id="rId32">
+      <w:hyperlink r:id="rId33">
         <w:r>
           <w:rPr>
             <w:rFonts w:ascii="Times New Roman" w:hAnsi="Times New Roman" w:cs="Times New Roman" w:eastAsia="Times New Roman"/>
@@ -12780,7 +12648,7 @@
         </w:rPr>
         <w:t xml:space="preserve">(1), 325–339. </w:t>
       </w:r>
-      <w:hyperlink r:id="rId33">
+      <w:hyperlink r:id="rId34">
         <w:r>
           <w:rPr>
             <w:rFonts w:ascii="Times New Roman" w:hAnsi="Times New Roman" w:cs="Times New Roman" w:eastAsia="Times New Roman"/>
@@ -12828,7 +12696,7 @@
         </w:rPr>
         <w:t xml:space="preserve"> Retrieved October 1, 2026, from </w:t>
       </w:r>
-      <w:hyperlink r:id="rId34">
+      <w:hyperlink r:id="rId35">
         <w:r>
           <w:rPr>
             <w:rFonts w:ascii="Times New Roman" w:hAnsi="Times New Roman" w:cs="Times New Roman" w:eastAsia="Times New Roman"/>
@@ -12876,7 +12744,7 @@
         </w:rPr>
         <w:t xml:space="preserve"> Retrieved October 1, 2026, from </w:t>
       </w:r>
-      <w:hyperlink r:id="rId35">
+      <w:hyperlink r:id="rId36">
         <w:r>
           <w:rPr>
             <w:rFonts w:ascii="Times New Roman" w:hAnsi="Times New Roman" w:cs="Times New Roman" w:eastAsia="Times New Roman"/>
@@ -12924,7 +12792,7 @@
         </w:rPr>
         <w:t xml:space="preserve"> [News/318: Regular Season 27 Mar–24 Mei 2026, 9 tim]. Retrieved October 1, 2026, from </w:t>
       </w:r>
-      <w:hyperlink r:id="rId36">
+      <w:hyperlink r:id="rId37">
         <w:r>
           <w:rPr>
             <w:rFonts w:ascii="Times New Roman" w:hAnsi="Times New Roman" w:cs="Times New Roman" w:eastAsia="Times New Roman"/>
@@ -12972,7 +12840,7 @@
         </w:rPr>
         <w:t xml:space="preserve"> [S18 Regular Season 14 Agu–18 Okt 2026, 9 tim, venue XO Hall, hadiah Rp 5 miliar]. Retrieved October 1, 2026, from </w:t>
       </w:r>
-      <w:hyperlink r:id="rId37">
+      <w:hyperlink r:id="rId38">
         <w:r>
           <w:rPr>
             <w:rFonts w:ascii="Times New Roman" w:hAnsi="Times New Roman" w:cs="Times New Roman" w:eastAsia="Times New Roman"/>
@@ -13040,7 +12908,7 @@
         </w:rPr>
         <w:t xml:space="preserve"> S1–S17]. Retrieved October 1, 2026, from </w:t>
       </w:r>
-      <w:hyperlink r:id="rId38">
+      <w:hyperlink r:id="rId39">
         <w:r>
           <w:rPr>
             <w:rFonts w:ascii="Times New Roman" w:hAnsi="Times New Roman" w:cs="Times New Roman" w:eastAsia="Times New Roman"/>
@@ -13148,7 +13016,7 @@
         </w:rPr>
         <w:t xml:space="preserve">]. Retrieved October 1, 2026, from </w:t>
       </w:r>
-      <w:hyperlink r:id="rId39">
+      <w:hyperlink r:id="rId40">
         <w:r>
           <w:rPr>
             <w:rFonts w:ascii="Times New Roman" w:hAnsi="Times New Roman" w:cs="Times New Roman" w:eastAsia="Times New Roman"/>
@@ -13196,7 +13064,7 @@
         </w:rPr>
         <w:t xml:space="preserve"> Retrieved October 1, 2026, from </w:t>
       </w:r>
-      <w:hyperlink r:id="rId40">
+      <w:hyperlink r:id="rId41">
         <w:r>
           <w:rPr>
             <w:rFonts w:ascii="Times New Roman" w:hAnsi="Times New Roman" w:cs="Times New Roman" w:eastAsia="Times New Roman"/>
@@ -13244,7 +13112,7 @@
         </w:rPr>
         <w:t xml:space="preserve">(1), 2316933. </w:t>
       </w:r>
-      <w:hyperlink r:id="rId41">
+      <w:hyperlink r:id="rId42">
         <w:r>
           <w:rPr>
             <w:rFonts w:ascii="Times New Roman" w:hAnsi="Times New Roman" w:cs="Times New Roman" w:eastAsia="Times New Roman"/>
@@ -13292,7 +13160,7 @@
         </w:rPr>
         <w:t xml:space="preserve">(7), 83–97. </w:t>
       </w:r>
-      <w:hyperlink r:id="rId42">
+      <w:hyperlink r:id="rId43">
         <w:r>
           <w:rPr>
             <w:rFonts w:ascii="Times New Roman" w:hAnsi="Times New Roman" w:cs="Times New Roman" w:eastAsia="Times New Roman"/>
@@ -13434,7 +13302,7 @@
         </w:rPr>
         <w:t xml:space="preserve">(8), 1545. </w:t>
       </w:r>
-      <w:hyperlink r:id="rId43">
+      <w:hyperlink r:id="rId44">
         <w:r>
           <w:rPr>
             <w:rFonts w:ascii="Times New Roman" w:hAnsi="Times New Roman" w:cs="Times New Roman" w:eastAsia="Times New Roman"/>
@@ -13482,7 +13350,7 @@
         </w:rPr>
         <w:t xml:space="preserve">(3), 163–171. </w:t>
       </w:r>
-      <w:hyperlink r:id="rId44">
+      <w:hyperlink r:id="rId45">
         <w:r>
           <w:rPr>
             <w:rFonts w:ascii="Times New Roman" w:hAnsi="Times New Roman" w:cs="Times New Roman" w:eastAsia="Times New Roman"/>
@@ -13530,7 +13398,7 @@
         </w:rPr>
         <w:t xml:space="preserve">(9), e0272926. </w:t>
       </w:r>
-      <w:hyperlink r:id="rId45">
+      <w:hyperlink r:id="rId46">
         <w:r>
           <w:rPr>
             <w:rFonts w:ascii="Times New Roman" w:hAnsi="Times New Roman" w:cs="Times New Roman" w:eastAsia="Times New Roman"/>
@@ -13598,7 +13466,7 @@
         </w:rPr>
         <w:t xml:space="preserve">(1), 1–16. </w:t>
       </w:r>
-      <w:hyperlink r:id="rId46">
+      <w:hyperlink r:id="rId47">
         <w:r>
           <w:rPr>
             <w:rFonts w:ascii="Times New Roman" w:hAnsi="Times New Roman" w:cs="Times New Roman" w:eastAsia="Times New Roman"/>
@@ -13726,7 +13594,7 @@
         </w:rPr>
         <w:t xml:space="preserve">(3). </w:t>
       </w:r>
-      <w:hyperlink r:id="rId47">
+      <w:hyperlink r:id="rId48">
         <w:r>
           <w:rPr>
             <w:rFonts w:ascii="Times New Roman" w:hAnsi="Times New Roman" w:cs="Times New Roman" w:eastAsia="Times New Roman"/>
@@ -13772,9 +13640,9 @@
           <w:color w:val="000000"/>
           <w:sz w:val="24"/>
         </w:rPr>
-        <w:t xml:space="preserve"> [blog, acuan Q1 2025: SEA 1,93 miliar instal + $625 jt IAP; Indonesia 870 jt unduhan]. Retrieved October 1, 2026, from </w:t>
-      </w:r>
-      <w:hyperlink r:id="rId48">
+        <w:t xml:space="preserve"> [blog, acuan Q1 2025: SEA 1,93 miliar instal dan $625 jt IAP; Indonesia 870 jt unduhan]. Retrieved October 1, 2026, from </w:t>
+      </w:r>
+      <w:hyperlink r:id="rId49">
         <w:r>
           <w:rPr>
             <w:rFonts w:ascii="Times New Roman" w:hAnsi="Times New Roman" w:cs="Times New Roman" w:eastAsia="Times New Roman"/>
@@ -13970,7 +13838,7 @@
         </w:rPr>
         <w:t xml:space="preserve">(4), 160–170. </w:t>
       </w:r>
-      <w:hyperlink r:id="rId49">
+      <w:hyperlink r:id="rId50">
         <w:r>
           <w:rPr>
             <w:rFonts w:ascii="Times New Roman" w:hAnsi="Times New Roman" w:cs="Times New Roman" w:eastAsia="Times New Roman"/>
@@ -14038,7 +13906,7 @@
         </w:rPr>
         <w:t xml:space="preserve">(3), 668–683. </w:t>
       </w:r>
-      <w:hyperlink r:id="rId50">
+      <w:hyperlink r:id="rId51">
         <w:r>
           <w:rPr>
             <w:rFonts w:ascii="Times New Roman" w:hAnsi="Times New Roman" w:cs="Times New Roman" w:eastAsia="Times New Roman"/>
@@ -14051,8 +13919,8 @@
       </w:hyperlink>
     </w:p>
     <w:sectPr>
-      <w:footerReference w:type="default" r:id="rId13"/>
-      <w:headerReference w:type="default" r:id="rId14"/>
+      <w:footerReference w:type="default" r:id="rId14"/>
+      <w:headerReference w:type="default" r:id="rId15"/>
       <w:pgSz w:w="11906" w:h="16838"/>
       <w:pgMar w:top="1701" w:right="1701" w:bottom="1701" w:left="2268" w:header="720" w:footer="720" w:gutter="0"/>
       <w:cols w:space="720"/>
@@ -14080,7 +13948,7 @@
   <w:p>
     <w:pPr>
       <w:pStyle w:val="Footer"/>
-      <w:jc w:val="center"/>
+      <w:jc w:val="right"/>
     </w:pPr>
     <w:r/>
     <w:r>

</xml_diff>